<commit_message>
feat: MAC_CP canônico atualizado — ajustes do perito (negrito, OVP placeholders, cabeçalho DEMANDA/N)
</commit_message>
<xml_diff>
--- a/L_000-0X26_D_00XXXXX-XX_CF-PHB_ENVOLVIDO_MAC_CP.docx
+++ b/L_000-0X26_D_00XXXXX-XX_CF-PHB_ENVOLVIDO_MAC_CP.docx
@@ -143,7 +143,7 @@
           <w:sz w:val="24"/>
           <w:szCs w:val="24"/>
         </w:rPr>
-        <w:t>[DD]</w:t>
+        <w:t>21</w:t>
       </w:r>
       <w:r>
         <w:rPr>
@@ -161,7 +161,7 @@
           <w:sz w:val="24"/>
           <w:szCs w:val="24"/>
         </w:rPr>
-        <w:t>[MÊS]</w:t>
+        <w:t>maio</w:t>
       </w:r>
       <w:r>
         <w:rPr>
@@ -179,7 +179,7 @@
           <w:sz w:val="24"/>
           <w:szCs w:val="24"/>
         </w:rPr>
-        <w:t>[ANO]</w:t>
+        <w:t>2026</w:t>
       </w:r>
       <w:r>
         <w:rPr>
@@ -210,20 +210,36 @@
       <w:r>
         <w:rPr>
           <w:rFonts w:ascii="Times New Roman" w:hAnsi="Times New Roman" w:cs="Times New Roman"/>
+          <w:sz w:val="24"/>
+          <w:szCs w:val="24"/>
+        </w:rPr>
+        <w:t>DEPARTAMENTO DE POLÍCIA CIENTÍFICA da POLÍCIA CIVIL DO ESTADO DO PIAUÍ</w:t>
+      </w:r>
+      <w:r>
+        <w:rPr>
+          <w:rFonts w:ascii="Times New Roman" w:hAnsi="Times New Roman" w:cs="Times New Roman"/>
+          <w:sz w:val="24"/>
+          <w:szCs w:val="24"/>
+        </w:rPr>
+        <w:t xml:space="preserve">, recebeu a requisição nº. </w:t>
+      </w:r>
+      <w:r>
+        <w:rPr>
+          <w:rFonts w:ascii="Times New Roman" w:hAnsi="Times New Roman" w:cs="Times New Roman"/>
           <w:b/>
           <w:bCs/>
           <w:sz w:val="24"/>
           <w:szCs w:val="24"/>
         </w:rPr>
-        <w:t>DEPARTAMENTO DE POLÍCIA CIENTÍFICA</w:t>
-      </w:r>
-      <w:r>
-        <w:rPr>
-          <w:rFonts w:ascii="Times New Roman" w:hAnsi="Times New Roman" w:cs="Times New Roman"/>
-          <w:sz w:val="24"/>
-          <w:szCs w:val="24"/>
-        </w:rPr>
-        <w:t xml:space="preserve"> da </w:t>
+        <w:t>[REQUISIÇÃO]</w:t>
+      </w:r>
+      <w:r>
+        <w:rPr>
+          <w:rFonts w:ascii="Times New Roman" w:hAnsi="Times New Roman" w:cs="Times New Roman"/>
+          <w:sz w:val="24"/>
+          <w:szCs w:val="24"/>
+        </w:rPr>
+        <w:t xml:space="preserve">, datada de </w:t>
       </w:r>
       <w:r>
         <w:rPr>
@@ -233,15 +249,7 @@
           <w:sz w:val="24"/>
           <w:szCs w:val="24"/>
         </w:rPr>
-        <w:t>POLÍCIA CIVIL DO ESTADO DO PIAUÍ</w:t>
-      </w:r>
-      <w:r>
-        <w:rPr>
-          <w:rFonts w:ascii="Times New Roman" w:hAnsi="Times New Roman" w:cs="Times New Roman"/>
-          <w:sz w:val="24"/>
-          <w:szCs w:val="24"/>
-        </w:rPr>
-        <w:t xml:space="preserve">, recebeu a requisição nº. </w:t>
+        <w:t>1</w:t>
       </w:r>
       <w:r>
         <w:rPr>
@@ -251,15 +259,15 @@
           <w:sz w:val="24"/>
           <w:szCs w:val="24"/>
         </w:rPr>
-        <w:t>[REQUISIÇÃO]</w:t>
-      </w:r>
-      <w:r>
-        <w:rPr>
-          <w:rFonts w:ascii="Times New Roman" w:hAnsi="Times New Roman" w:cs="Times New Roman"/>
-          <w:sz w:val="24"/>
-          <w:szCs w:val="24"/>
-        </w:rPr>
-        <w:t xml:space="preserve">, datada de </w:t>
+        <w:t>4</w:t>
+      </w:r>
+      <w:r>
+        <w:rPr>
+          <w:rFonts w:ascii="Times New Roman" w:hAnsi="Times New Roman" w:cs="Times New Roman"/>
+          <w:sz w:val="24"/>
+          <w:szCs w:val="24"/>
+        </w:rPr>
+        <w:t xml:space="preserve"> de </w:t>
       </w:r>
       <w:r>
         <w:rPr>
@@ -269,7 +277,7 @@
           <w:sz w:val="24"/>
           <w:szCs w:val="24"/>
         </w:rPr>
-        <w:t>[TOTAL]</w:t>
+        <w:t>maio</w:t>
       </w:r>
       <w:r>
         <w:rPr>
@@ -287,15 +295,15 @@
           <w:sz w:val="24"/>
           <w:szCs w:val="24"/>
         </w:rPr>
-        <w:t>[MÊS]</w:t>
-      </w:r>
-      <w:r>
-        <w:rPr>
-          <w:rFonts w:ascii="Times New Roman" w:hAnsi="Times New Roman" w:cs="Times New Roman"/>
-          <w:sz w:val="24"/>
-          <w:szCs w:val="24"/>
-        </w:rPr>
-        <w:t xml:space="preserve"> de </w:t>
+        <w:t>2026</w:t>
+      </w:r>
+      <w:r>
+        <w:rPr>
+          <w:rFonts w:ascii="Times New Roman" w:hAnsi="Times New Roman" w:cs="Times New Roman"/>
+          <w:sz w:val="24"/>
+          <w:szCs w:val="24"/>
+        </w:rPr>
+        <w:t xml:space="preserve">, emitida pela </w:t>
       </w:r>
       <w:r>
         <w:rPr>
@@ -305,15 +313,15 @@
           <w:sz w:val="24"/>
           <w:szCs w:val="24"/>
         </w:rPr>
-        <w:t>[ANO]</w:t>
-      </w:r>
-      <w:r>
-        <w:rPr>
-          <w:rFonts w:ascii="Times New Roman" w:hAnsi="Times New Roman" w:cs="Times New Roman"/>
-          <w:sz w:val="24"/>
-          <w:szCs w:val="24"/>
-        </w:rPr>
-        <w:t xml:space="preserve">, emitida pela </w:t>
+        <w:t>[EMISSOR]</w:t>
+      </w:r>
+      <w:r>
+        <w:rPr>
+          <w:rFonts w:ascii="Times New Roman" w:hAnsi="Times New Roman" w:cs="Times New Roman"/>
+          <w:sz w:val="24"/>
+          <w:szCs w:val="24"/>
+        </w:rPr>
+        <w:t xml:space="preserve">, solicitando a realização de </w:t>
       </w:r>
       <w:r>
         <w:rPr>
@@ -323,15 +331,15 @@
           <w:sz w:val="24"/>
           <w:szCs w:val="24"/>
         </w:rPr>
-        <w:t>[EMISSOR]</w:t>
-      </w:r>
-      <w:r>
-        <w:rPr>
-          <w:rFonts w:ascii="Times New Roman" w:hAnsi="Times New Roman" w:cs="Times New Roman"/>
-          <w:sz w:val="24"/>
-          <w:szCs w:val="24"/>
-        </w:rPr>
-        <w:t xml:space="preserve">, solicitando a realização de </w:t>
+        <w:t>EXAME DE IDENTIFICAÇÃO DE SUBSTÂNCIA</w:t>
+      </w:r>
+      <w:r>
+        <w:rPr>
+          <w:rFonts w:ascii="Times New Roman" w:hAnsi="Times New Roman" w:cs="Times New Roman"/>
+          <w:sz w:val="24"/>
+          <w:szCs w:val="24"/>
+        </w:rPr>
+        <w:t xml:space="preserve"> relacionada ao </w:t>
       </w:r>
       <w:r>
         <w:rPr>
@@ -341,15 +349,15 @@
           <w:sz w:val="24"/>
           <w:szCs w:val="24"/>
         </w:rPr>
-        <w:t>EXAME DE IDENTIFICAÇÃO DE SUBSTÂNCIA</w:t>
-      </w:r>
-      <w:r>
-        <w:rPr>
-          <w:rFonts w:ascii="Times New Roman" w:hAnsi="Times New Roman" w:cs="Times New Roman"/>
-          <w:sz w:val="24"/>
-          <w:szCs w:val="24"/>
-        </w:rPr>
-        <w:t xml:space="preserve"> relacionada ao BO </w:t>
+        <w:t>BO</w:t>
+      </w:r>
+      <w:r>
+        <w:rPr>
+          <w:rFonts w:ascii="Times New Roman" w:hAnsi="Times New Roman" w:cs="Times New Roman"/>
+          <w:sz w:val="24"/>
+          <w:szCs w:val="24"/>
+        </w:rPr>
+        <w:t xml:space="preserve"> </w:t>
       </w:r>
       <w:r>
         <w:rPr>
@@ -367,7 +375,31 @@
           <w:sz w:val="24"/>
           <w:szCs w:val="24"/>
         </w:rPr>
-        <w:t xml:space="preserve"> / APF </w:t>
+        <w:t>.</w:t>
+      </w:r>
+    </w:p>
+    <w:p>
+      <w:pPr>
+        <w:pStyle w:val="SemEspaamento"/>
+      </w:pPr>
+    </w:p>
+    <w:p>
+      <w:pPr>
+        <w:spacing w:before="80" w:after="80"/>
+        <w:jc w:val="both"/>
+        <w:rPr>
+          <w:rFonts w:ascii="Times New Roman" w:hAnsi="Times New Roman" w:cs="Times New Roman"/>
+          <w:sz w:val="24"/>
+          <w:szCs w:val="24"/>
+        </w:rPr>
+      </w:pPr>
+      <w:r>
+        <w:rPr>
+          <w:rFonts w:ascii="Times New Roman" w:hAnsi="Times New Roman" w:cs="Times New Roman"/>
+          <w:sz w:val="24"/>
+          <w:szCs w:val="24"/>
+        </w:rPr>
+        <w:t xml:space="preserve">A demanda foi encaminhada ao Setor de Química Forense, sendo designado o Perito Criminal </w:t>
       </w:r>
       <w:r>
         <w:rPr>
@@ -377,21 +409,304 @@
           <w:sz w:val="24"/>
           <w:szCs w:val="24"/>
         </w:rPr>
-        <w:t>[APF]</w:t>
-      </w:r>
-      <w:r>
-        <w:rPr>
-          <w:rFonts w:ascii="Times New Roman" w:hAnsi="Times New Roman" w:cs="Times New Roman"/>
-          <w:sz w:val="24"/>
-          <w:szCs w:val="24"/>
-        </w:rPr>
-        <w:t>.</w:t>
+        <w:t>FAUSTO RODRIGO PINTO DE VASCONCELOS</w:t>
+      </w:r>
+      <w:r>
+        <w:rPr>
+          <w:rFonts w:ascii="Times New Roman" w:hAnsi="Times New Roman" w:cs="Times New Roman"/>
+          <w:sz w:val="24"/>
+          <w:szCs w:val="24"/>
+        </w:rPr>
+        <w:t xml:space="preserve"> para execução do exame definitivo. Cumprindo o disposto na requisição, o perito relata com veracidade os procedimentos realizados com o objetivo de realizar identificação qualitativa de substâncias apreendidas, com determinação da natureza química de possível material entorpecente, mediante aplicação de metodologia analítica recomendada para substâncias controladas em conformidade com as diretrizes do </w:t>
+      </w:r>
+      <w:proofErr w:type="spellStart"/>
+      <w:r>
+        <w:rPr>
+          <w:rFonts w:ascii="Times New Roman" w:hAnsi="Times New Roman" w:cs="Times New Roman"/>
+          <w:i/>
+          <w:iCs/>
+          <w:sz w:val="24"/>
+          <w:szCs w:val="24"/>
+        </w:rPr>
+        <w:t>Scientific</w:t>
+      </w:r>
+      <w:proofErr w:type="spellEnd"/>
+      <w:r>
+        <w:rPr>
+          <w:rFonts w:ascii="Times New Roman" w:hAnsi="Times New Roman" w:cs="Times New Roman"/>
+          <w:i/>
+          <w:iCs/>
+          <w:sz w:val="24"/>
+          <w:szCs w:val="24"/>
+        </w:rPr>
+        <w:t xml:space="preserve"> </w:t>
+      </w:r>
+      <w:proofErr w:type="spellStart"/>
+      <w:r>
+        <w:rPr>
+          <w:rFonts w:ascii="Times New Roman" w:hAnsi="Times New Roman" w:cs="Times New Roman"/>
+          <w:i/>
+          <w:iCs/>
+          <w:sz w:val="24"/>
+          <w:szCs w:val="24"/>
+        </w:rPr>
+        <w:t>Working</w:t>
+      </w:r>
+      <w:proofErr w:type="spellEnd"/>
+      <w:r>
+        <w:rPr>
+          <w:rFonts w:ascii="Times New Roman" w:hAnsi="Times New Roman" w:cs="Times New Roman"/>
+          <w:i/>
+          <w:iCs/>
+          <w:sz w:val="24"/>
+          <w:szCs w:val="24"/>
+        </w:rPr>
+        <w:t xml:space="preserve"> </w:t>
+      </w:r>
+      <w:proofErr w:type="spellStart"/>
+      <w:r>
+        <w:rPr>
+          <w:rFonts w:ascii="Times New Roman" w:hAnsi="Times New Roman" w:cs="Times New Roman"/>
+          <w:i/>
+          <w:iCs/>
+          <w:sz w:val="24"/>
+          <w:szCs w:val="24"/>
+        </w:rPr>
+        <w:t>Group</w:t>
+      </w:r>
+      <w:proofErr w:type="spellEnd"/>
+      <w:r>
+        <w:rPr>
+          <w:rFonts w:ascii="Times New Roman" w:hAnsi="Times New Roman" w:cs="Times New Roman"/>
+          <w:i/>
+          <w:iCs/>
+          <w:sz w:val="24"/>
+          <w:szCs w:val="24"/>
+        </w:rPr>
+        <w:t xml:space="preserve"> for </w:t>
+      </w:r>
+      <w:proofErr w:type="spellStart"/>
+      <w:r>
+        <w:rPr>
+          <w:rFonts w:ascii="Times New Roman" w:hAnsi="Times New Roman" w:cs="Times New Roman"/>
+          <w:i/>
+          <w:iCs/>
+          <w:sz w:val="24"/>
+          <w:szCs w:val="24"/>
+        </w:rPr>
+        <w:t>the</w:t>
+      </w:r>
+      <w:proofErr w:type="spellEnd"/>
+      <w:r>
+        <w:rPr>
+          <w:rFonts w:ascii="Times New Roman" w:hAnsi="Times New Roman" w:cs="Times New Roman"/>
+          <w:i/>
+          <w:iCs/>
+          <w:sz w:val="24"/>
+          <w:szCs w:val="24"/>
+        </w:rPr>
+        <w:t xml:space="preserve"> </w:t>
+      </w:r>
+      <w:proofErr w:type="spellStart"/>
+      <w:r>
+        <w:rPr>
+          <w:rFonts w:ascii="Times New Roman" w:hAnsi="Times New Roman" w:cs="Times New Roman"/>
+          <w:i/>
+          <w:iCs/>
+          <w:sz w:val="24"/>
+          <w:szCs w:val="24"/>
+        </w:rPr>
+        <w:t>Analysis</w:t>
+      </w:r>
+      <w:proofErr w:type="spellEnd"/>
+      <w:r>
+        <w:rPr>
+          <w:rFonts w:ascii="Times New Roman" w:hAnsi="Times New Roman" w:cs="Times New Roman"/>
+          <w:i/>
+          <w:iCs/>
+          <w:sz w:val="24"/>
+          <w:szCs w:val="24"/>
+        </w:rPr>
+        <w:t xml:space="preserve"> </w:t>
+      </w:r>
+      <w:proofErr w:type="spellStart"/>
+      <w:r>
+        <w:rPr>
+          <w:rFonts w:ascii="Times New Roman" w:hAnsi="Times New Roman" w:cs="Times New Roman"/>
+          <w:i/>
+          <w:iCs/>
+          <w:sz w:val="24"/>
+          <w:szCs w:val="24"/>
+        </w:rPr>
+        <w:t>of</w:t>
+      </w:r>
+      <w:proofErr w:type="spellEnd"/>
+      <w:r>
+        <w:rPr>
+          <w:rFonts w:ascii="Times New Roman" w:hAnsi="Times New Roman" w:cs="Times New Roman"/>
+          <w:i/>
+          <w:iCs/>
+          <w:sz w:val="24"/>
+          <w:szCs w:val="24"/>
+        </w:rPr>
+        <w:t xml:space="preserve"> </w:t>
+      </w:r>
+      <w:proofErr w:type="spellStart"/>
+      <w:r>
+        <w:rPr>
+          <w:rFonts w:ascii="Times New Roman" w:hAnsi="Times New Roman" w:cs="Times New Roman"/>
+          <w:i/>
+          <w:iCs/>
+          <w:sz w:val="24"/>
+          <w:szCs w:val="24"/>
+        </w:rPr>
+        <w:t>Seized</w:t>
+      </w:r>
+      <w:proofErr w:type="spellEnd"/>
+      <w:r>
+        <w:rPr>
+          <w:rFonts w:ascii="Times New Roman" w:hAnsi="Times New Roman" w:cs="Times New Roman"/>
+          <w:i/>
+          <w:iCs/>
+          <w:sz w:val="24"/>
+          <w:szCs w:val="24"/>
+        </w:rPr>
+        <w:t xml:space="preserve"> </w:t>
+      </w:r>
+      <w:proofErr w:type="spellStart"/>
+      <w:r>
+        <w:rPr>
+          <w:rFonts w:ascii="Times New Roman" w:hAnsi="Times New Roman" w:cs="Times New Roman"/>
+          <w:i/>
+          <w:iCs/>
+          <w:sz w:val="24"/>
+          <w:szCs w:val="24"/>
+        </w:rPr>
+        <w:t>Drugs</w:t>
+      </w:r>
+      <w:proofErr w:type="spellEnd"/>
+      <w:r>
+        <w:rPr>
+          <w:rFonts w:ascii="Times New Roman" w:hAnsi="Times New Roman" w:cs="Times New Roman"/>
+          <w:sz w:val="24"/>
+          <w:szCs w:val="24"/>
+        </w:rPr>
+        <w:t xml:space="preserve"> (SWGDRUG Rev. 8.1, 2022) e dos Procedimentos Operacionais Padrão da SENASP/MJ nº 9.09 (2024).</w:t>
+      </w:r>
+      <w:r>
+        <w:rPr>
+          <w:rStyle w:val="Refdenotaderodap"/>
+          <w:rFonts w:ascii="Times New Roman" w:hAnsi="Times New Roman" w:cs="Times New Roman"/>
+          <w:sz w:val="24"/>
+          <w:szCs w:val="24"/>
+        </w:rPr>
+        <w:footnoteReference w:id="1"/>
       </w:r>
     </w:p>
     <w:p>
       <w:pPr>
         <w:pStyle w:val="SemEspaamento"/>
       </w:pPr>
+    </w:p>
+    <w:p>
+      <w:pPr>
+        <w:jc w:val="both"/>
+        <w:rPr>
+          <w:rFonts w:ascii="Times New Roman" w:hAnsi="Times New Roman" w:cs="Times New Roman"/>
+          <w:sz w:val="24"/>
+          <w:szCs w:val="24"/>
+        </w:rPr>
+      </w:pPr>
+      <w:r>
+        <w:rPr>
+          <w:rFonts w:ascii="Times New Roman" w:hAnsi="Times New Roman" w:cs="Times New Roman"/>
+          <w:sz w:val="24"/>
+          <w:szCs w:val="24"/>
+        </w:rPr>
+        <w:t xml:space="preserve">O material submetido à análise foi apreendido no contexto do procedimento policial envolvendo </w:t>
+      </w:r>
+      <w:r>
+        <w:rPr>
+          <w:rFonts w:ascii="Times New Roman" w:hAnsi="Times New Roman" w:cs="Times New Roman"/>
+          <w:b/>
+          <w:bCs/>
+          <w:sz w:val="24"/>
+          <w:szCs w:val="24"/>
+        </w:rPr>
+        <w:t>[ENVOLVIDO] — CPF [CPF]</w:t>
+      </w:r>
+      <w:r>
+        <w:rPr>
+          <w:rFonts w:ascii="Times New Roman" w:hAnsi="Times New Roman" w:cs="Times New Roman"/>
+          <w:sz w:val="24"/>
+          <w:szCs w:val="24"/>
+        </w:rPr>
+        <w:t xml:space="preserve">, conforme consta na requisição. Os resultados serão encaminhados à </w:t>
+      </w:r>
+      <w:r>
+        <w:rPr>
+          <w:rFonts w:ascii="Times New Roman" w:hAnsi="Times New Roman" w:cs="Times New Roman"/>
+          <w:b/>
+          <w:bCs/>
+          <w:sz w:val="24"/>
+          <w:szCs w:val="24"/>
+        </w:rPr>
+        <w:t>[DESTINO] – PARNAÍBA/PI</w:t>
+      </w:r>
+      <w:r>
+        <w:rPr>
+          <w:rFonts w:ascii="Times New Roman" w:hAnsi="Times New Roman" w:cs="Times New Roman"/>
+          <w:sz w:val="24"/>
+          <w:szCs w:val="24"/>
+        </w:rPr>
+        <w:t xml:space="preserve"> para os devidos fins. </w:t>
+      </w:r>
+      <w:r>
+        <w:rPr>
+          <w:rFonts w:ascii="Times New Roman" w:eastAsia="Times New Roman" w:hAnsi="Times New Roman" w:cs="Times New Roman"/>
+          <w:sz w:val="24"/>
+          <w:szCs w:val="24"/>
+        </w:rPr>
+        <w:t xml:space="preserve">Os exames foram conduzidos, preferencialmente, seguindo a ordem cronológica das demandas do setor. </w:t>
+      </w:r>
+    </w:p>
+    <w:p>
+      <w:pPr>
+        <w:pStyle w:val="SemEspaamento"/>
+      </w:pPr>
+    </w:p>
+    <w:p>
+      <w:pPr>
+        <w:pStyle w:val="Ttulo1"/>
+        <w:rPr>
+          <w:rFonts w:ascii="Times New Roman" w:hAnsi="Times New Roman" w:cs="Times New Roman"/>
+        </w:rPr>
+      </w:pPr>
+      <w:r>
+        <w:rPr>
+          <w:rFonts w:ascii="Times New Roman" w:hAnsi="Times New Roman" w:cs="Times New Roman"/>
+        </w:rPr>
+        <w:t>1.   MATERIAL APREENDIDO</w:t>
+      </w:r>
+    </w:p>
+    <w:p>
+      <w:pPr>
+        <w:pStyle w:val="Ttulo2"/>
+        <w:spacing w:before="120"/>
+        <w:rPr>
+          <w:rFonts w:ascii="Times New Roman" w:hAnsi="Times New Roman" w:cs="Times New Roman"/>
+          <w:sz w:val="24"/>
+          <w:szCs w:val="24"/>
+        </w:rPr>
+      </w:pPr>
+      <w:r>
+        <w:rPr>
+          <w:rFonts w:ascii="Times New Roman" w:hAnsi="Times New Roman" w:cs="Times New Roman"/>
+          <w:sz w:val="24"/>
+          <w:szCs w:val="24"/>
+        </w:rPr>
+        <w:t>1.1.   Cadeia de Custódia, Identificação e Descrição do Material</w:t>
+      </w:r>
     </w:p>
     <w:p>
       <w:pPr>
@@ -409,7 +724,7 @@
           <w:sz w:val="24"/>
           <w:szCs w:val="24"/>
         </w:rPr>
-        <w:t xml:space="preserve">A demanda foi encaminhada ao Setor de Química Forense, sendo designado o Perito Criminal </w:t>
+        <w:t xml:space="preserve">O material apreendido, proveniente da unidade policial, adentrou nesta unidade pericial acondicionado no Envelope de Vestígios/Lacre nº. </w:t>
       </w:r>
       <w:r>
         <w:rPr>
@@ -419,65 +734,15 @@
           <w:sz w:val="24"/>
           <w:szCs w:val="24"/>
         </w:rPr>
-        <w:t>FAUSTO RODRIGO PINTO DE VASCONCELOS</w:t>
-      </w:r>
-      <w:r>
-        <w:rPr>
-          <w:rFonts w:ascii="Times New Roman" w:hAnsi="Times New Roman" w:cs="Times New Roman"/>
-          <w:sz w:val="24"/>
-          <w:szCs w:val="24"/>
-        </w:rPr>
-        <w:t xml:space="preserve"> para execução do exame definitivo. Cumprindo o disposto na requisição, o perito relata com veracidade os procedimentos realizados com o objetivo de realizar identificação qualitativa de substâncias apreendidas, com determinação da natureza química de possível material entorpecente, mediante aplicação de metodologia analítica recomendada para substâncias controladas em conformidade com as diretrizes do </w:t>
-      </w:r>
-      <w:r>
-        <w:rPr>
-          <w:rFonts w:ascii="Times New Roman" w:hAnsi="Times New Roman" w:cs="Times New Roman"/>
-          <w:i/>
-          <w:iCs/>
-          <w:sz w:val="24"/>
-          <w:szCs w:val="24"/>
-        </w:rPr>
-        <w:t>Scientific Working Group for the Analysis of Seized Drugs</w:t>
-      </w:r>
-      <w:r>
-        <w:rPr>
-          <w:rFonts w:ascii="Times New Roman" w:hAnsi="Times New Roman" w:cs="Times New Roman"/>
-          <w:sz w:val="24"/>
-          <w:szCs w:val="24"/>
-        </w:rPr>
-        <w:t xml:space="preserve"> (SWGDRUG Rev. 8.1, 2022) e dos Procedimentos Operacionais Padrão da SENASP/MJ nº 9.09 (2024).</w:t>
-      </w:r>
-      <w:r>
-        <w:rPr>
-          <w:rStyle w:val="Refdenotaderodap"/>
-          <w:rFonts w:ascii="Times New Roman" w:hAnsi="Times New Roman" w:cs="Times New Roman"/>
-          <w:sz w:val="24"/>
-          <w:szCs w:val="24"/>
-        </w:rPr>
-        <w:footnoteReference w:id="1"/>
-      </w:r>
-    </w:p>
-    <w:p>
-      <w:pPr>
-        <w:pStyle w:val="SemEspaamento"/>
-      </w:pPr>
-    </w:p>
-    <w:p>
-      <w:pPr>
-        <w:jc w:val="both"/>
-        <w:rPr>
-          <w:rFonts w:ascii="Times New Roman" w:hAnsi="Times New Roman" w:cs="Times New Roman"/>
-          <w:sz w:val="24"/>
-          <w:szCs w:val="24"/>
-        </w:rPr>
-      </w:pPr>
-      <w:r>
-        <w:rPr>
-          <w:rFonts w:ascii="Times New Roman" w:hAnsi="Times New Roman" w:cs="Times New Roman"/>
-          <w:sz w:val="24"/>
-          <w:szCs w:val="24"/>
-        </w:rPr>
-        <w:t xml:space="preserve">O material submetido à análise foi apreendido no contexto do procedimento policial envolvendo </w:t>
+        <w:t>[ENV_ENTRADA]</w:t>
+      </w:r>
+      <w:r>
+        <w:rPr>
+          <w:rFonts w:ascii="Times New Roman" w:hAnsi="Times New Roman" w:cs="Times New Roman"/>
+          <w:sz w:val="24"/>
+          <w:szCs w:val="24"/>
+        </w:rPr>
+        <w:t xml:space="preserve">, cadastrado no sistema AMPLO sob nº. </w:t>
       </w:r>
       <w:r>
         <w:rPr>
@@ -487,15 +752,15 @@
           <w:sz w:val="24"/>
           <w:szCs w:val="24"/>
         </w:rPr>
-        <w:t>[ENVOLVIDO] — CPF [CPF]</w:t>
-      </w:r>
-      <w:r>
-        <w:rPr>
-          <w:rFonts w:ascii="Times New Roman" w:hAnsi="Times New Roman" w:cs="Times New Roman"/>
-          <w:sz w:val="24"/>
-          <w:szCs w:val="24"/>
-        </w:rPr>
-        <w:t xml:space="preserve">, conforme consta na requisição. Os resultados serão encaminhados à </w:t>
+        <w:t>[AMPLO]</w:t>
+      </w:r>
+      <w:r>
+        <w:rPr>
+          <w:rFonts w:ascii="Times New Roman" w:hAnsi="Times New Roman" w:cs="Times New Roman"/>
+          <w:sz w:val="24"/>
+          <w:szCs w:val="24"/>
+        </w:rPr>
+        <w:t xml:space="preserve">. Foi submetido a exame preliminar no núcleo pericial pelo Perito Criminal plantonista, referente à Demanda nº. </w:t>
       </w:r>
       <w:r>
         <w:rPr>
@@ -505,80 +770,15 @@
           <w:sz w:val="24"/>
           <w:szCs w:val="24"/>
         </w:rPr>
-        <w:t>[DESTINO] – PARNAÍBA/PI</w:t>
-      </w:r>
-      <w:r>
-        <w:rPr>
-          <w:rFonts w:ascii="Times New Roman" w:hAnsi="Times New Roman" w:cs="Times New Roman"/>
-          <w:sz w:val="24"/>
-          <w:szCs w:val="24"/>
-        </w:rPr>
-        <w:t xml:space="preserve"> para os devidos fins. </w:t>
-      </w:r>
-      <w:r>
-        <w:rPr>
-          <w:rFonts w:ascii="Times New Roman" w:eastAsia="Times New Roman" w:hAnsi="Times New Roman" w:cs="Times New Roman"/>
-          <w:sz w:val="24"/>
-          <w:szCs w:val="24"/>
-        </w:rPr>
-        <w:t xml:space="preserve">Os exames foram conduzidos, preferencialmente, seguindo a ordem cronológica das demandas do setor. </w:t>
-      </w:r>
-    </w:p>
-    <w:p>
-      <w:pPr>
-        <w:pStyle w:val="SemEspaamento"/>
-      </w:pPr>
-    </w:p>
-    <w:p>
-      <w:pPr>
-        <w:pStyle w:val="Ttulo1"/>
-        <w:rPr>
-          <w:rFonts w:ascii="Times New Roman" w:hAnsi="Times New Roman" w:cs="Times New Roman"/>
-        </w:rPr>
-      </w:pPr>
-      <w:r>
-        <w:rPr>
-          <w:rFonts w:ascii="Times New Roman" w:hAnsi="Times New Roman" w:cs="Times New Roman"/>
-        </w:rPr>
-        <w:t>1.   MATERIAL APREENDIDO</w:t>
-      </w:r>
-    </w:p>
-    <w:p>
-      <w:pPr>
-        <w:pStyle w:val="Ttulo2"/>
-        <w:spacing w:before="120"/>
-        <w:rPr>
-          <w:rFonts w:ascii="Times New Roman" w:hAnsi="Times New Roman" w:cs="Times New Roman"/>
-          <w:sz w:val="24"/>
-          <w:szCs w:val="24"/>
-        </w:rPr>
-      </w:pPr>
-      <w:r>
-        <w:rPr>
-          <w:rFonts w:ascii="Times New Roman" w:hAnsi="Times New Roman" w:cs="Times New Roman"/>
-          <w:sz w:val="24"/>
-          <w:szCs w:val="24"/>
-        </w:rPr>
-        <w:t>1.1.   Cadeia de Custódia, Identificação e Descrição do Material</w:t>
-      </w:r>
-    </w:p>
-    <w:p>
-      <w:pPr>
-        <w:spacing w:before="80" w:after="80"/>
-        <w:jc w:val="both"/>
-        <w:rPr>
-          <w:rFonts w:ascii="Times New Roman" w:hAnsi="Times New Roman" w:cs="Times New Roman"/>
-          <w:sz w:val="24"/>
-          <w:szCs w:val="24"/>
-        </w:rPr>
-      </w:pPr>
-      <w:r>
-        <w:rPr>
-          <w:rFonts w:ascii="Times New Roman" w:hAnsi="Times New Roman" w:cs="Times New Roman"/>
-          <w:sz w:val="24"/>
-          <w:szCs w:val="24"/>
-        </w:rPr>
-        <w:t xml:space="preserve">O material apreendido, proveniente da unidade policial, adentrou nesta unidade pericial acondicionado no Envelope de Vestígios/Lacre nº. </w:t>
+        <w:t>[DEMANDA_PRELIM]</w:t>
+      </w:r>
+      <w:r>
+        <w:rPr>
+          <w:rFonts w:ascii="Times New Roman" w:hAnsi="Times New Roman" w:cs="Times New Roman"/>
+          <w:sz w:val="24"/>
+          <w:szCs w:val="24"/>
+        </w:rPr>
+        <w:t xml:space="preserve">. Nessa etapa, o material foi transferido para o Envelope de Vestígios/Lacre nº. </w:t>
       </w:r>
       <w:r>
         <w:rPr>
@@ -588,60 +788,6 @@
           <w:sz w:val="24"/>
           <w:szCs w:val="24"/>
         </w:rPr>
-        <w:t>[ENV_ENTRADA]</w:t>
-      </w:r>
-      <w:r>
-        <w:rPr>
-          <w:rFonts w:ascii="Times New Roman" w:hAnsi="Times New Roman" w:cs="Times New Roman"/>
-          <w:sz w:val="24"/>
-          <w:szCs w:val="24"/>
-        </w:rPr>
-        <w:t xml:space="preserve">, cadastrado no sistema AMPLO sob nº. </w:t>
-      </w:r>
-      <w:r>
-        <w:rPr>
-          <w:rFonts w:ascii="Times New Roman" w:hAnsi="Times New Roman" w:cs="Times New Roman"/>
-          <w:b/>
-          <w:bCs/>
-          <w:sz w:val="24"/>
-          <w:szCs w:val="24"/>
-        </w:rPr>
-        <w:t>[AMPLO]</w:t>
-      </w:r>
-      <w:r>
-        <w:rPr>
-          <w:rFonts w:ascii="Times New Roman" w:hAnsi="Times New Roman" w:cs="Times New Roman"/>
-          <w:sz w:val="24"/>
-          <w:szCs w:val="24"/>
-        </w:rPr>
-        <w:t xml:space="preserve">. Foi submetido a exame preliminar no núcleo pericial pelo Perito Criminal plantonista, referente à Demanda nº. </w:t>
-      </w:r>
-      <w:r>
-        <w:rPr>
-          <w:rFonts w:ascii="Times New Roman" w:hAnsi="Times New Roman" w:cs="Times New Roman"/>
-          <w:b/>
-          <w:bCs/>
-          <w:sz w:val="24"/>
-          <w:szCs w:val="24"/>
-        </w:rPr>
-        <w:t>[DEMANDA_PRELIM]</w:t>
-      </w:r>
-      <w:r>
-        <w:rPr>
-          <w:rFonts w:ascii="Times New Roman" w:hAnsi="Times New Roman" w:cs="Times New Roman"/>
-          <w:sz w:val="24"/>
-          <w:szCs w:val="24"/>
-        </w:rPr>
-        <w:t xml:space="preserve">. Nessa etapa, o material foi transferido para o Envelope de Vestígios/Lacre nº. </w:t>
-      </w:r>
-      <w:r>
-        <w:rPr>
-          <w:rFonts w:ascii="Times New Roman" w:hAnsi="Times New Roman" w:cs="Times New Roman"/>
-          <w:b/>
-          <w:bCs/>
-          <w:sz w:val="24"/>
-          <w:szCs w:val="24"/>
-        </w:rPr>
         <w:t>[ENV_POS_PRELIM]</w:t>
       </w:r>
       <w:r>
@@ -650,20 +796,38 @@
           <w:sz w:val="24"/>
           <w:szCs w:val="24"/>
         </w:rPr>
-        <w:t xml:space="preserve"> e encaminhado ao Setor de Química Forense para análise definitiva, em observância à cadeia de custódia da prova prevista nos arts. 158-A a 158-F do CPP (Lei 13.964/2019).</w:t>
-      </w:r>
-    </w:p>
-    <w:p>
-      <w:pPr>
-        <w:rPr>
-          <w:sz w:val="24"/>
-          <w:szCs w:val="24"/>
-        </w:rPr>
-      </w:pPr>
-    </w:p>
-    <w:p>
-      <w:pPr>
-        <w:spacing w:before="80" w:after="80"/>
+        <w:t xml:space="preserve"> e encaminhado ao Setor de Química Forense para análise definitiva, em observância à cadeia de custódia da prova prevista nos </w:t>
+      </w:r>
+      <w:proofErr w:type="spellStart"/>
+      <w:r>
+        <w:rPr>
+          <w:rFonts w:ascii="Times New Roman" w:hAnsi="Times New Roman" w:cs="Times New Roman"/>
+          <w:sz w:val="24"/>
+          <w:szCs w:val="24"/>
+        </w:rPr>
+        <w:t>arts</w:t>
+      </w:r>
+      <w:proofErr w:type="spellEnd"/>
+      <w:r>
+        <w:rPr>
+          <w:rFonts w:ascii="Times New Roman" w:hAnsi="Times New Roman" w:cs="Times New Roman"/>
+          <w:sz w:val="24"/>
+          <w:szCs w:val="24"/>
+        </w:rPr>
+        <w:t>. 158-A a 158-F do CPP (Lei 13.964/2019).</w:t>
+      </w:r>
+    </w:p>
+    <w:p>
+      <w:pPr>
+        <w:rPr>
+          <w:sz w:val="24"/>
+          <w:szCs w:val="24"/>
+        </w:rPr>
+      </w:pPr>
+    </w:p>
+    <w:p>
+      <w:pPr>
+        <w:pStyle w:val="SemEspaamento"/>
         <w:jc w:val="both"/>
         <w:rPr>
           <w:rFonts w:ascii="Times New Roman" w:hAnsi="Times New Roman" w:cs="Times New Roman"/>
@@ -677,21 +841,14 @@
           <w:sz w:val="24"/>
           <w:szCs w:val="24"/>
         </w:rPr>
-        <w:t xml:space="preserve">Para a realização do exame definitivo, procedeu-se à abertura regular do envelope de vestígios, seguida de inspeção visual, contagem dos volumes, registro fotográfico, aferição de massa bruta e </w:t>
-      </w:r>
-      <w:r>
-        <w:rPr>
-          <w:rFonts w:ascii="Times New Roman" w:hAnsi="Times New Roman" w:cs="Times New Roman"/>
-          <w:sz w:val="24"/>
-          <w:szCs w:val="24"/>
-        </w:rPr>
         <w:lastRenderedPageBreak/>
-        <w:t>seleção de frações representativas para análise química. As constatações estão descritas na Tabela 1, a seguir.</w:t>
-      </w:r>
-    </w:p>
-    <w:p>
-      <w:pPr>
-        <w:jc w:val="center"/>
+        <w:t>Para a realização do exame definitivo, procedeu-se à abertura regular do envelope de vestígios, seguida de inspeção visual, contagem dos volumes, registro fotográfico, aferição de massa bruta e seleção de frações representativas para análise química. As constatações estão descritas na Tabela 1, a seguir.</w:t>
+      </w:r>
+    </w:p>
+    <w:p>
+      <w:pPr>
+        <w:pStyle w:val="SemEspaamento"/>
+        <w:jc w:val="both"/>
         <w:rPr>
           <w:rFonts w:ascii="Times New Roman" w:hAnsi="Times New Roman" w:cs="Times New Roman"/>
           <w:sz w:val="24"/>
@@ -706,11 +863,11 @@
         <w:tblLook w:val="04A0" w:firstRow="1" w:lastRow="0" w:firstColumn="1" w:lastColumn="0" w:noHBand="0" w:noVBand="1"/>
       </w:tblPr>
       <w:tblGrid>
-        <w:gridCol w:w="676"/>
-        <w:gridCol w:w="2428"/>
+        <w:gridCol w:w="682"/>
+        <w:gridCol w:w="2290"/>
         <w:gridCol w:w="1316"/>
-        <w:gridCol w:w="1933"/>
-        <w:gridCol w:w="3140"/>
+        <w:gridCol w:w="1944"/>
+        <w:gridCol w:w="3261"/>
       </w:tblGrid>
       <w:tr>
         <w:trPr>
@@ -782,13 +939,23 @@
                 <w:szCs w:val="20"/>
               </w:rPr>
             </w:pPr>
-            <w:r>
-              <w:rPr>
-                <w:rFonts w:ascii="Times New Roman" w:hAnsi="Times New Roman" w:cs="Times New Roman"/>
-                <w:sz w:val="20"/>
-                <w:szCs w:val="20"/>
-              </w:rPr>
-              <w:t>Qtd.</w:t>
+            <w:proofErr w:type="spellStart"/>
+            <w:r>
+              <w:rPr>
+                <w:rFonts w:ascii="Times New Roman" w:hAnsi="Times New Roman" w:cs="Times New Roman"/>
+                <w:sz w:val="20"/>
+                <w:szCs w:val="20"/>
+              </w:rPr>
+              <w:t>Qtd</w:t>
+            </w:r>
+            <w:proofErr w:type="spellEnd"/>
+            <w:r>
+              <w:rPr>
+                <w:rFonts w:ascii="Times New Roman" w:hAnsi="Times New Roman" w:cs="Times New Roman"/>
+                <w:sz w:val="20"/>
+                <w:szCs w:val="20"/>
+              </w:rPr>
+              <w:t>.</w:t>
             </w:r>
           </w:p>
         </w:tc>
@@ -1036,7 +1203,7 @@
           <w:noProof/>
         </w:rPr>
         <w:drawing>
-          <wp:inline distT="0" distB="0" distL="0" distR="0" wp14:anchorId="0EBDEAA3" wp14:editId="43BA53F2">
+          <wp:inline distT="0" distB="0" distL="0" distR="0" wp14:anchorId="4E5977F7" wp14:editId="595C0EE7">
             <wp:extent cx="5980427" cy="4364437"/>
             <wp:effectExtent l="19050" t="19050" r="20955" b="17145"/>
             <wp:docPr id="1" name="Imagem 1" descr="C:\Users\labnm\Downloads\WhatsApp Image 2026-05-27 at 07.48.58.jpeg"/>
@@ -1268,6 +1435,7 @@
         <w:rPr>
           <w:rFonts w:ascii="Times New Roman" w:hAnsi="Times New Roman" w:cs="Times New Roman"/>
         </w:rPr>
+        <w:lastRenderedPageBreak/>
         <w:t>2.   EXAMES REALIZADOS</w:t>
       </w:r>
     </w:p>
@@ -1306,8 +1474,141 @@
           <w:sz w:val="24"/>
           <w:szCs w:val="24"/>
         </w:rPr>
-        <w:lastRenderedPageBreak/>
-        <w:t xml:space="preserve">Para assegurar validade, rastreabilidade metrológica e reprodutibilidade dos resultados, foram adotados controles analíticos, conforme POP-QF-PHB-002 (V 1.0, 10/05/2026). </w:t>
+        <w:t xml:space="preserve">Para assegurar validade, rastreabilidade metrológica e reprodutibilidade dos resultados, foram adotados controles analíticos, conforme POP-QF-PHB-002 (V 2.0, 08/06/2026). O espectrômetro </w:t>
+      </w:r>
+      <w:r>
+        <w:rPr>
+          <w:rFonts w:ascii="Times New Roman" w:eastAsia="Times New Roman" w:hAnsi="Times New Roman" w:cs="Times New Roman"/>
+          <w:i/>
+          <w:iCs/>
+          <w:sz w:val="24"/>
+          <w:szCs w:val="24"/>
+        </w:rPr>
+        <w:t xml:space="preserve">Bruker Alpha II</w:t>
+      </w:r>
+      <w:r>
+        <w:rPr>
+          <w:rFonts w:ascii="Times New Roman" w:hAnsi="Times New Roman" w:cs="Times New Roman"/>
+          <w:sz w:val="24"/>
+          <w:szCs w:val="24"/>
+        </w:rPr>
+        <w:t xml:space="preserve"> (nº de série 210363) foi submetido ao Protocolo de Qualificação de Desempenho (OVP — </w:t>
+      </w:r>
+      <w:r>
+        <w:rPr>
+          <w:rFonts w:ascii="Times New Roman" w:eastAsia="Times New Roman" w:hAnsi="Times New Roman" w:cs="Times New Roman"/>
+          <w:i/>
+          <w:iCs/>
+          <w:sz w:val="24"/>
+          <w:szCs w:val="24"/>
+        </w:rPr>
+        <w:t xml:space="preserve">Operational Verification Protocol</w:t>
+      </w:r>
+      <w:r>
+        <w:rPr>
+          <w:rFonts w:ascii="Times New Roman" w:hAnsi="Times New Roman" w:cs="Times New Roman"/>
+          <w:sz w:val="24"/>
+          <w:szCs w:val="24"/>
+        </w:rPr>
+        <w:t xml:space="preserve"> / PQ Test, Bruker Optik GmbH) em </w:t>
+      </w:r>
+      <w:r>
+        <w:rPr>
+          <w:rFonts w:ascii="Times New Roman" w:hAnsi="Times New Roman" w:cs="Times New Roman"/>
+          <w:sz w:val="24"/>
+          <w:szCs w:val="24"/>
+        </w:rPr>
+        <w:t xml:space="preserve">[DATA_INICIO_OVP]</w:t>
+      </w:r>
+      <w:r>
+        <w:rPr>
+          <w:rFonts w:ascii="Times New Roman" w:hAnsi="Times New Roman" w:cs="Times New Roman"/>
+          <w:sz w:val="24"/>
+          <w:szCs w:val="24"/>
+        </w:rPr>
+        <w:t xml:space="preserve">, validade </w:t>
+      </w:r>
+      <w:r>
+        <w:rPr>
+          <w:rFonts w:ascii="Times New Roman" w:hAnsi="Times New Roman" w:cs="Times New Roman"/>
+          <w:sz w:val="24"/>
+          <w:szCs w:val="24"/>
+        </w:rPr>
+        <w:t xml:space="preserve">[DATA_VALID_OVP]</w:t>
+      </w:r>
+      <w:r>
+        <w:rPr>
+          <w:rFonts w:ascii="Times New Roman" w:hAnsi="Times New Roman" w:cs="Times New Roman"/>
+          <w:sz w:val="24"/>
+          <w:szCs w:val="24"/>
+        </w:rPr>
+        <w:t xml:space="preserve">, com resultado geral </w:t>
+      </w:r>
+      <w:r>
+        <w:rPr>
+          <w:rFonts w:ascii="Times New Roman" w:eastAsia="Times New Roman" w:hAnsi="Times New Roman" w:cs="Times New Roman"/>
+          <w:b/>
+          <w:bCs/>
+          <w:sz w:val="24"/>
+          <w:szCs w:val="24"/>
+        </w:rPr>
+        <w:t xml:space="preserve">PASSED</w:t>
+      </w:r>
+      <w:r>
+        <w:rPr>
+          <w:rFonts w:ascii="Times New Roman" w:hAnsi="Times New Roman" w:cs="Times New Roman"/>
+          <w:sz w:val="24"/>
+          <w:szCs w:val="24"/>
+        </w:rPr>
+        <w:t xml:space="preserve"> em todos os testes obrigatórios: (i) Relação Sinal/Ruído (S/N) medida: </w:t>
+      </w:r>
+      <w:r>
+        <w:rPr>
+          <w:rFonts w:ascii="Times New Roman" w:hAnsi="Times New Roman" w:cs="Times New Roman"/>
+          <w:sz w:val="24"/>
+          <w:szCs w:val="24"/>
+        </w:rPr>
+        <w:t xml:space="preserve">[SN_VALOR]</w:t>
+      </w:r>
+      <w:r>
+        <w:rPr>
+          <w:rFonts w:ascii="Times New Roman" w:hAnsi="Times New Roman" w:cs="Times New Roman"/>
+          <w:sz w:val="24"/>
+          <w:szCs w:val="24"/>
+        </w:rPr>
+        <w:t xml:space="preserve"> (mínimo exigido: 150); (ii) Desvio máximo da linha 100%: </w:t>
+      </w:r>
+      <w:r>
+        <w:rPr>
+          <w:rFonts w:ascii="Times New Roman" w:hAnsi="Times New Roman" w:cs="Times New Roman"/>
+          <w:sz w:val="24"/>
+          <w:szCs w:val="24"/>
+        </w:rPr>
+        <w:t xml:space="preserve">[LINHA100_VALOR]</w:t>
+      </w:r>
+      <w:r>
+        <w:rPr>
+          <w:rFonts w:ascii="Times New Roman" w:hAnsi="Times New Roman" w:cs="Times New Roman"/>
+          <w:sz w:val="24"/>
+          <w:szCs w:val="24"/>
+        </w:rPr>
+        <w:t xml:space="preserve">% (máximo admissível: 2,0%); (iii) Exatidão de número de onda verificada com poliestireno padrão: desvio medido de </w:t>
+      </w:r>
+      <w:r>
+        <w:rPr>
+          <w:rFonts w:ascii="Times New Roman" w:hAnsi="Times New Roman" w:cs="Times New Roman"/>
+          <w:sz w:val="24"/>
+          <w:szCs w:val="24"/>
+        </w:rPr>
+        <w:t xml:space="preserve">[DESVIO_NV]</w:t>
+      </w:r>
+      <w:r>
+        <w:rPr>
+          <w:rFonts w:ascii="Times New Roman" w:hAnsi="Times New Roman" w:cs="Times New Roman"/>
+          <w:sz w:val="24"/>
+          <w:szCs w:val="24"/>
+        </w:rPr>
+        <w:t xml:space="preserve"> cm⁻¹ (máximo admissível: ±0,50 cm⁻¹). Os resultados atestam plena conformidade instrumental à época da realização dos exames.</w:t>
       </w:r>
     </w:p>
     <w:p>
@@ -1393,7 +1694,25 @@
           <w:sz w:val="24"/>
           <w:szCs w:val="24"/>
         </w:rPr>
-        <w:t>Frações representativas foram submetidas ao ensaio colorimétrico com sal Fast Blue B (cloreto de di-</w:t>
+        <w:t xml:space="preserve">Frações representativas foram submetidas ao ensaio colorimétrico com sal Fast Blue B (cloreto de </w:t>
+      </w:r>
+      <w:proofErr w:type="spellStart"/>
+      <w:r>
+        <w:rPr>
+          <w:rFonts w:ascii="Times New Roman" w:eastAsia="Times New Roman" w:hAnsi="Times New Roman" w:cs="Times New Roman"/>
+          <w:sz w:val="24"/>
+          <w:szCs w:val="24"/>
+        </w:rPr>
+        <w:t>di</w:t>
+      </w:r>
+      <w:proofErr w:type="spellEnd"/>
+      <w:r>
+        <w:rPr>
+          <w:rFonts w:ascii="Times New Roman" w:eastAsia="Times New Roman" w:hAnsi="Times New Roman" w:cs="Times New Roman"/>
+          <w:sz w:val="24"/>
+          <w:szCs w:val="24"/>
+        </w:rPr>
+        <w:t>-</w:t>
       </w:r>
       <w:r>
         <w:rPr>
@@ -1411,7 +1730,43 @@
           <w:sz w:val="24"/>
           <w:szCs w:val="24"/>
         </w:rPr>
-        <w:t xml:space="preserve">-anisidina tetrazolio) — </w:t>
+        <w:t>-</w:t>
+      </w:r>
+      <w:proofErr w:type="spellStart"/>
+      <w:r>
+        <w:rPr>
+          <w:rFonts w:ascii="Times New Roman" w:eastAsia="Times New Roman" w:hAnsi="Times New Roman" w:cs="Times New Roman"/>
+          <w:sz w:val="24"/>
+          <w:szCs w:val="24"/>
+        </w:rPr>
+        <w:t>anisidina</w:t>
+      </w:r>
+      <w:proofErr w:type="spellEnd"/>
+      <w:r>
+        <w:rPr>
+          <w:rFonts w:ascii="Times New Roman" w:eastAsia="Times New Roman" w:hAnsi="Times New Roman" w:cs="Times New Roman"/>
+          <w:sz w:val="24"/>
+          <w:szCs w:val="24"/>
+        </w:rPr>
+        <w:t xml:space="preserve"> </w:t>
+      </w:r>
+      <w:proofErr w:type="spellStart"/>
+      <w:r>
+        <w:rPr>
+          <w:rFonts w:ascii="Times New Roman" w:eastAsia="Times New Roman" w:hAnsi="Times New Roman" w:cs="Times New Roman"/>
+          <w:sz w:val="24"/>
+          <w:szCs w:val="24"/>
+        </w:rPr>
+        <w:t>tetrazolio</w:t>
+      </w:r>
+      <w:proofErr w:type="spellEnd"/>
+      <w:r>
+        <w:rPr>
+          <w:rFonts w:ascii="Times New Roman" w:eastAsia="Times New Roman" w:hAnsi="Times New Roman" w:cs="Times New Roman"/>
+          <w:sz w:val="24"/>
+          <w:szCs w:val="24"/>
+        </w:rPr>
+        <w:t xml:space="preserve">) — </w:t>
       </w:r>
       <w:r>
         <w:rPr>
@@ -1429,7 +1784,61 @@
           <w:sz w:val="24"/>
           <w:szCs w:val="24"/>
         </w:rPr>
-        <w:t xml:space="preserve"> —, método de orientação empregado para pesquisa de canabinoides fenólicos. O método baseia-se na formação de uma ligação azo (–N=N–) altamente conjugada entre o sal diazônio e o grupamento fenólico do Δ9-THC, produzindo coloração vermelho-púrpura/avermelhada característica na fase hexânica. </w:t>
+        <w:t xml:space="preserve"> —, método de orientação empregado para pesquisa de </w:t>
+      </w:r>
+      <w:proofErr w:type="spellStart"/>
+      <w:r>
+        <w:rPr>
+          <w:rFonts w:ascii="Times New Roman" w:eastAsia="Times New Roman" w:hAnsi="Times New Roman" w:cs="Times New Roman"/>
+          <w:sz w:val="24"/>
+          <w:szCs w:val="24"/>
+        </w:rPr>
+        <w:t>canabinoides</w:t>
+      </w:r>
+      <w:proofErr w:type="spellEnd"/>
+      <w:r>
+        <w:rPr>
+          <w:rFonts w:ascii="Times New Roman" w:eastAsia="Times New Roman" w:hAnsi="Times New Roman" w:cs="Times New Roman"/>
+          <w:sz w:val="24"/>
+          <w:szCs w:val="24"/>
+        </w:rPr>
+        <w:t xml:space="preserve"> fenólicos. O método baseia-se na formação de uma ligação azo (–N=N–) altamente conjugada entre o sal </w:t>
+      </w:r>
+      <w:proofErr w:type="spellStart"/>
+      <w:r>
+        <w:rPr>
+          <w:rFonts w:ascii="Times New Roman" w:eastAsia="Times New Roman" w:hAnsi="Times New Roman" w:cs="Times New Roman"/>
+          <w:sz w:val="24"/>
+          <w:szCs w:val="24"/>
+        </w:rPr>
+        <w:t>diazônio</w:t>
+      </w:r>
+      <w:proofErr w:type="spellEnd"/>
+      <w:r>
+        <w:rPr>
+          <w:rFonts w:ascii="Times New Roman" w:eastAsia="Times New Roman" w:hAnsi="Times New Roman" w:cs="Times New Roman"/>
+          <w:sz w:val="24"/>
+          <w:szCs w:val="24"/>
+        </w:rPr>
+        <w:t xml:space="preserve"> e o grupamento fenólico do Δ9-THC, produzindo coloração vermelho-púrpura/avermelhada característica na fase </w:t>
+      </w:r>
+      <w:proofErr w:type="spellStart"/>
+      <w:r>
+        <w:rPr>
+          <w:rFonts w:ascii="Times New Roman" w:eastAsia="Times New Roman" w:hAnsi="Times New Roman" w:cs="Times New Roman"/>
+          <w:sz w:val="24"/>
+          <w:szCs w:val="24"/>
+        </w:rPr>
+        <w:t>hexânica</w:t>
+      </w:r>
+      <w:proofErr w:type="spellEnd"/>
+      <w:r>
+        <w:rPr>
+          <w:rFonts w:ascii="Times New Roman" w:eastAsia="Times New Roman" w:hAnsi="Times New Roman" w:cs="Times New Roman"/>
+          <w:sz w:val="24"/>
+          <w:szCs w:val="24"/>
+        </w:rPr>
+        <w:t xml:space="preserve">. </w:t>
       </w:r>
     </w:p>
     <w:p>
@@ -1458,7 +1867,25 @@
           <w:sz w:val="24"/>
           <w:szCs w:val="24"/>
         </w:rPr>
-        <w:t xml:space="preserve"> sal Fast Blue B; n-hexano p.a. </w:t>
+        <w:t xml:space="preserve"> sal Fast Blue B; n-hexano </w:t>
+      </w:r>
+      <w:proofErr w:type="spellStart"/>
+      <w:r>
+        <w:rPr>
+          <w:rFonts w:ascii="Times New Roman" w:eastAsia="Times New Roman" w:hAnsi="Times New Roman" w:cs="Times New Roman"/>
+          <w:sz w:val="24"/>
+          <w:szCs w:val="24"/>
+        </w:rPr>
+        <w:t>p.a</w:t>
+      </w:r>
+      <w:proofErr w:type="spellEnd"/>
+      <w:r>
+        <w:rPr>
+          <w:rFonts w:ascii="Times New Roman" w:eastAsia="Times New Roman" w:hAnsi="Times New Roman" w:cs="Times New Roman"/>
+          <w:sz w:val="24"/>
+          <w:szCs w:val="24"/>
+        </w:rPr>
+        <w:t xml:space="preserve">. </w:t>
       </w:r>
     </w:p>
     <w:p>
@@ -1482,7 +1909,43 @@
           <w:sz w:val="24"/>
           <w:szCs w:val="24"/>
         </w:rPr>
-        <w:t xml:space="preserve"> Fase 1 — fração em solução salina com Fast Blue B (1 mg/mL), aguardar 2 minutos; Fase 2 — adição de n-hexano e agitação; coloração vermelho-avermelhada intensa e estável na fase orgânica constitui resultado presuntivo positivo.</w:t>
+        <w:t xml:space="preserve"> Fase 1 — fração em solução salina com Fast Blue B (1 mg/</w:t>
+      </w:r>
+      <w:proofErr w:type="spellStart"/>
+      <w:r>
+        <w:rPr>
+          <w:rFonts w:ascii="Times New Roman" w:eastAsia="Times New Roman" w:hAnsi="Times New Roman" w:cs="Times New Roman"/>
+          <w:sz w:val="24"/>
+          <w:szCs w:val="24"/>
+        </w:rPr>
+        <w:t>mL</w:t>
+      </w:r>
+      <w:proofErr w:type="spellEnd"/>
+      <w:r>
+        <w:rPr>
+          <w:rFonts w:ascii="Times New Roman" w:eastAsia="Times New Roman" w:hAnsi="Times New Roman" w:cs="Times New Roman"/>
+          <w:sz w:val="24"/>
+          <w:szCs w:val="24"/>
+        </w:rPr>
+        <w:t xml:space="preserve">), aguardar 2 minutos; Fase 2 — adição de n-hexano e agitação; coloração </w:t>
+      </w:r>
+      <w:proofErr w:type="spellStart"/>
+      <w:r>
+        <w:rPr>
+          <w:rFonts w:ascii="Times New Roman" w:eastAsia="Times New Roman" w:hAnsi="Times New Roman" w:cs="Times New Roman"/>
+          <w:sz w:val="24"/>
+          <w:szCs w:val="24"/>
+        </w:rPr>
+        <w:t>vermelho-avermelhada</w:t>
+      </w:r>
+      <w:proofErr w:type="spellEnd"/>
+      <w:r>
+        <w:rPr>
+          <w:rFonts w:ascii="Times New Roman" w:eastAsia="Times New Roman" w:hAnsi="Times New Roman" w:cs="Times New Roman"/>
+          <w:sz w:val="24"/>
+          <w:szCs w:val="24"/>
+        </w:rPr>
+        <w:t xml:space="preserve"> intensa e estável na fase orgânica constitui resultado presuntivo positivo.</w:t>
       </w:r>
       <w:r>
         <w:t xml:space="preserve"> </w:t>
@@ -1527,7 +1990,7 @@
           <w:noProof/>
         </w:rPr>
         <w:drawing>
-          <wp:inline distT="0" distB="0" distL="0" distR="0" wp14:anchorId="73FB04B4" wp14:editId="7FF067F8">
+          <wp:inline distT="0" distB="0" distL="0" distR="0" wp14:anchorId="3BB49B65" wp14:editId="1ABA459D">
             <wp:extent cx="3710574" cy="1487170"/>
             <wp:effectExtent l="0" t="0" r="4445" b="0"/>
             <wp:docPr id="4" name="Imagem 4"/>
@@ -1643,7 +2106,29 @@
           <w:sz w:val="20"/>
           <w:szCs w:val="20"/>
         </w:rPr>
-        <w:t xml:space="preserve"> B em meio hexânico.</w:t>
+        <w:t xml:space="preserve"> B em meio </w:t>
+      </w:r>
+      <w:proofErr w:type="spellStart"/>
+      <w:r>
+        <w:rPr>
+          <w:rFonts w:ascii="Times New Roman" w:hAnsi="Times New Roman" w:cs="Times New Roman"/>
+          <w:i/>
+          <w:iCs/>
+          <w:sz w:val="20"/>
+          <w:szCs w:val="20"/>
+        </w:rPr>
+        <w:t>hexânico</w:t>
+      </w:r>
+      <w:proofErr w:type="spellEnd"/>
+      <w:r>
+        <w:rPr>
+          <w:rFonts w:ascii="Times New Roman" w:hAnsi="Times New Roman" w:cs="Times New Roman"/>
+          <w:i/>
+          <w:iCs/>
+          <w:sz w:val="20"/>
+          <w:szCs w:val="20"/>
+        </w:rPr>
+        <w:t>.</w:t>
       </w:r>
     </w:p>
     <w:p>
@@ -1750,6 +2235,7 @@
         <w:jc w:val="both"/>
       </w:pPr>
       <w:r>
+        <w:lastRenderedPageBreak/>
         <w:t>A análise foi conduzida com avaliação macroscópica direta e sob lupa (10×), com a finalidade de pesquisar os seguintes caracteres morfológicos relevantes:</w:t>
       </w:r>
     </w:p>
@@ -1783,7 +2269,25 @@
           <w:sz w:val="20"/>
           <w:szCs w:val="20"/>
         </w:rPr>
-        <w:t xml:space="preserve"> material vegetal fragmentado de coloração marrom-esverdeada a marrom-escura, consistente com oxidação de clorofila e terpenoides em material ressecado, aspecto e odor compatíveis com </w:t>
+        <w:t xml:space="preserve"> material vegetal fragmentado de coloração marrom-esverdeada a marrom-escura, consistente com oxidação de clorofila e </w:t>
+      </w:r>
+      <w:proofErr w:type="spellStart"/>
+      <w:r>
+        <w:rPr>
+          <w:rFonts w:ascii="Times New Roman" w:hAnsi="Times New Roman" w:cs="Times New Roman"/>
+          <w:sz w:val="20"/>
+          <w:szCs w:val="20"/>
+        </w:rPr>
+        <w:t>terpenoides</w:t>
+      </w:r>
+      <w:proofErr w:type="spellEnd"/>
+      <w:r>
+        <w:rPr>
+          <w:rFonts w:ascii="Times New Roman" w:hAnsi="Times New Roman" w:cs="Times New Roman"/>
+          <w:sz w:val="20"/>
+          <w:szCs w:val="20"/>
+        </w:rPr>
+        <w:t xml:space="preserve"> em material ressecado, aspecto e odor compatíveis com </w:t>
       </w:r>
       <w:r>
         <w:rPr>
@@ -1833,7 +2337,61 @@
           <w:sz w:val="20"/>
           <w:szCs w:val="20"/>
         </w:rPr>
-        <w:t xml:space="preserve"> resinoso/herbáceo característico, atribuível ao perfil terpênico da espécie (mirceno, β-cariofileno), persistente mesmo após ressecamento em virtude da baixa pressão de vapor desses compostos a temperatura ambiente.</w:t>
+        <w:t xml:space="preserve"> resinoso/herbáceo característico, atribuível ao perfil </w:t>
+      </w:r>
+      <w:proofErr w:type="spellStart"/>
+      <w:r>
+        <w:rPr>
+          <w:rFonts w:ascii="Times New Roman" w:hAnsi="Times New Roman" w:cs="Times New Roman"/>
+          <w:sz w:val="20"/>
+          <w:szCs w:val="20"/>
+        </w:rPr>
+        <w:t>terpênico</w:t>
+      </w:r>
+      <w:proofErr w:type="spellEnd"/>
+      <w:r>
+        <w:rPr>
+          <w:rFonts w:ascii="Times New Roman" w:hAnsi="Times New Roman" w:cs="Times New Roman"/>
+          <w:sz w:val="20"/>
+          <w:szCs w:val="20"/>
+        </w:rPr>
+        <w:t xml:space="preserve"> da espécie (</w:t>
+      </w:r>
+      <w:proofErr w:type="spellStart"/>
+      <w:r>
+        <w:rPr>
+          <w:rFonts w:ascii="Times New Roman" w:hAnsi="Times New Roman" w:cs="Times New Roman"/>
+          <w:sz w:val="20"/>
+          <w:szCs w:val="20"/>
+        </w:rPr>
+        <w:t>mirceno</w:t>
+      </w:r>
+      <w:proofErr w:type="spellEnd"/>
+      <w:r>
+        <w:rPr>
+          <w:rFonts w:ascii="Times New Roman" w:hAnsi="Times New Roman" w:cs="Times New Roman"/>
+          <w:sz w:val="20"/>
+          <w:szCs w:val="20"/>
+        </w:rPr>
+        <w:t>, β-</w:t>
+      </w:r>
+      <w:proofErr w:type="spellStart"/>
+      <w:r>
+        <w:rPr>
+          <w:rFonts w:ascii="Times New Roman" w:hAnsi="Times New Roman" w:cs="Times New Roman"/>
+          <w:sz w:val="20"/>
+          <w:szCs w:val="20"/>
+        </w:rPr>
+        <w:t>cariofileno</w:t>
+      </w:r>
+      <w:proofErr w:type="spellEnd"/>
+      <w:r>
+        <w:rPr>
+          <w:rFonts w:ascii="Times New Roman" w:hAnsi="Times New Roman" w:cs="Times New Roman"/>
+          <w:sz w:val="20"/>
+          <w:szCs w:val="20"/>
+        </w:rPr>
+        <w:t>), persistente mesmo após ressecamento em virtude da baixa pressão de vapor desses compostos a temperatura ambiente.</w:t>
       </w:r>
     </w:p>
     <w:p>
@@ -1908,7 +2466,6 @@
           <w:sz w:val="20"/>
           <w:szCs w:val="20"/>
         </w:rPr>
-        <w:lastRenderedPageBreak/>
         <w:t>Tricomas:</w:t>
       </w:r>
       <w:r>
@@ -1950,7 +2507,43 @@
           <w:sz w:val="20"/>
           <w:szCs w:val="20"/>
         </w:rPr>
-        <w:t xml:space="preserve"> [quando presentes] identificados fragmentos de brácteas papiráceas com venação característica, compatíveis com cálices de inflorescência feminina de </w:t>
+        <w:t xml:space="preserve"> identificados fragmentos de brácteas papiráceas com </w:t>
+      </w:r>
+      <w:proofErr w:type="spellStart"/>
+      <w:r>
+        <w:rPr>
+          <w:rFonts w:ascii="Times New Roman" w:hAnsi="Times New Roman" w:cs="Times New Roman"/>
+          <w:sz w:val="20"/>
+          <w:szCs w:val="20"/>
+        </w:rPr>
+        <w:t>venação</w:t>
+      </w:r>
+      <w:proofErr w:type="spellEnd"/>
+      <w:r>
+        <w:rPr>
+          <w:rFonts w:ascii="Times New Roman" w:hAnsi="Times New Roman" w:cs="Times New Roman"/>
+          <w:sz w:val="20"/>
+          <w:szCs w:val="20"/>
+        </w:rPr>
+        <w:t xml:space="preserve"> característica, compatíveis com cálices de inflorescência feminina de Cannabis sp. identificados fragmentos de brácteas papiráceas com </w:t>
+      </w:r>
+      <w:proofErr w:type="spellStart"/>
+      <w:r>
+        <w:rPr>
+          <w:rFonts w:ascii="Times New Roman" w:hAnsi="Times New Roman" w:cs="Times New Roman"/>
+          <w:sz w:val="20"/>
+          <w:szCs w:val="20"/>
+        </w:rPr>
+        <w:t>venação</w:t>
+      </w:r>
+      <w:proofErr w:type="spellEnd"/>
+      <w:r>
+        <w:rPr>
+          <w:rFonts w:ascii="Times New Roman" w:hAnsi="Times New Roman" w:cs="Times New Roman"/>
+          <w:sz w:val="20"/>
+          <w:szCs w:val="20"/>
+        </w:rPr>
+        <w:t xml:space="preserve"> característica, compatíveis com cálices de inflorescência feminina de </w:t>
       </w:r>
       <w:r>
         <w:rPr>
@@ -2129,41 +2722,61 @@
           <w:sz w:val="24"/>
           <w:szCs w:val="24"/>
         </w:rPr>
-        <w:t xml:space="preserve"> Espectrômetro </w:t>
-      </w:r>
-      <w:r>
-        <w:rPr>
-          <w:rStyle w:val="Forte"/>
-          <w:rFonts w:ascii="Times New Roman" w:hAnsi="Times New Roman" w:cs="Times New Roman"/>
-          <w:b w:val="0"/>
-          <w:bCs w:val="0"/>
+        <w:t xml:space="preserve"> </w:t>
+      </w:r>
+      <w:r>
+        <w:rPr>
+          <w:rFonts w:ascii="Times New Roman" w:eastAsia="Times New Roman" w:hAnsi="Times New Roman" w:cs="Times New Roman"/>
+          <w:sz w:val="24"/>
+          <w:szCs w:val="24"/>
+        </w:rPr>
+        <w:t xml:space="preserve">Espectrômetro </w:t>
+      </w:r>
+      <w:proofErr w:type="spellStart"/>
+      <w:r>
+        <w:rPr>
+          <w:rFonts w:ascii="Times New Roman" w:eastAsia="Times New Roman" w:hAnsi="Times New Roman" w:cs="Times New Roman"/>
           <w:i/>
           <w:iCs/>
           <w:sz w:val="24"/>
           <w:szCs w:val="24"/>
         </w:rPr>
-        <w:t>Bruker Alpha II</w:t>
-      </w:r>
-      <w:r>
-        <w:rPr>
-          <w:rFonts w:ascii="Times New Roman" w:hAnsi="Times New Roman" w:cs="Times New Roman"/>
-          <w:sz w:val="24"/>
-          <w:szCs w:val="24"/>
-        </w:rPr>
-        <w:t>, equipado com acessório de Reflectância Total Atenuada (ATR) com cristal de diamante, operando na região espectral de 4000 a 650 cm⁻¹, com 16 varreduras (</w:t>
-      </w:r>
-      <w:r>
-        <w:rPr>
-          <w:rStyle w:val="nfase"/>
-          <w:rFonts w:ascii="Times New Roman" w:hAnsi="Times New Roman" w:cs="Times New Roman"/>
+        <w:t>Bruker</w:t>
+      </w:r>
+      <w:proofErr w:type="spellEnd"/>
+      <w:r>
+        <w:rPr>
+          <w:rFonts w:ascii="Times New Roman" w:eastAsia="Times New Roman" w:hAnsi="Times New Roman" w:cs="Times New Roman"/>
+          <w:i/>
+          <w:iCs/>
+          <w:sz w:val="24"/>
+          <w:szCs w:val="24"/>
+        </w:rPr>
+        <w:t xml:space="preserve"> Alpha II</w:t>
+      </w:r>
+      <w:r>
+        <w:rPr>
+          <w:rFonts w:ascii="Times New Roman" w:eastAsia="Times New Roman" w:hAnsi="Times New Roman" w:cs="Times New Roman"/>
+          <w:sz w:val="24"/>
+          <w:szCs w:val="24"/>
+        </w:rPr>
+        <w:t xml:space="preserve"> (nº de série 210363), equipado com acessório de Reflectância Total Atenuada (ATR) com cristal de diamante (ATR Platinum T — 1 reflexão), operando na região espectral de 4000 a 650 cm⁻¹, com 16 varreduras (</w:t>
+      </w:r>
+      <w:proofErr w:type="spellStart"/>
+      <w:r>
+        <w:rPr>
+          <w:rFonts w:ascii="Times New Roman" w:eastAsia="Times New Roman" w:hAnsi="Times New Roman" w:cs="Times New Roman"/>
+          <w:i/>
+          <w:iCs/>
           <w:sz w:val="24"/>
           <w:szCs w:val="24"/>
         </w:rPr>
         <w:t>scans</w:t>
       </w:r>
-      <w:r>
-        <w:rPr>
-          <w:rFonts w:ascii="Times New Roman" w:hAnsi="Times New Roman" w:cs="Times New Roman"/>
+      <w:proofErr w:type="spellEnd"/>
+      <w:r>
+        <w:rPr>
+          <w:rFonts w:ascii="Times New Roman" w:eastAsia="Times New Roman" w:hAnsi="Times New Roman" w:cs="Times New Roman"/>
           <w:sz w:val="24"/>
           <w:szCs w:val="24"/>
         </w:rPr>
@@ -2171,20 +2784,99 @@
       </w:r>
       <w:r>
         <w:rPr>
-          <w:rStyle w:val="nfase"/>
-          <w:rFonts w:ascii="Times New Roman" w:hAnsi="Times New Roman" w:cs="Times New Roman"/>
-          <w:sz w:val="24"/>
-          <w:szCs w:val="24"/>
-        </w:rPr>
-        <w:t>OPUS DrugID Wizard</w:t>
-      </w:r>
-      <w:r>
-        <w:rPr>
-          <w:rFonts w:ascii="Times New Roman" w:hAnsi="Times New Roman" w:cs="Times New Roman"/>
-          <w:sz w:val="24"/>
-          <w:szCs w:val="24"/>
-        </w:rPr>
-        <w:t xml:space="preserve"> (Bruker Optik GmbH).</w:t>
+          <w:rFonts w:ascii="Times New Roman" w:eastAsia="Times New Roman" w:hAnsi="Times New Roman" w:cs="Times New Roman"/>
+          <w:i/>
+          <w:iCs/>
+          <w:sz w:val="24"/>
+          <w:szCs w:val="24"/>
+        </w:rPr>
+        <w:t xml:space="preserve">OPUS </w:t>
+      </w:r>
+      <w:proofErr w:type="spellStart"/>
+      <w:r>
+        <w:rPr>
+          <w:rFonts w:ascii="Times New Roman" w:eastAsia="Times New Roman" w:hAnsi="Times New Roman" w:cs="Times New Roman"/>
+          <w:i/>
+          <w:iCs/>
+          <w:sz w:val="24"/>
+          <w:szCs w:val="24"/>
+        </w:rPr>
+        <w:t>DrugID</w:t>
+      </w:r>
+      <w:proofErr w:type="spellEnd"/>
+      <w:r>
+        <w:rPr>
+          <w:rFonts w:ascii="Times New Roman" w:eastAsia="Times New Roman" w:hAnsi="Times New Roman" w:cs="Times New Roman"/>
+          <w:i/>
+          <w:iCs/>
+          <w:sz w:val="24"/>
+          <w:szCs w:val="24"/>
+        </w:rPr>
+        <w:t xml:space="preserve"> </w:t>
+      </w:r>
+      <w:proofErr w:type="spellStart"/>
+      <w:r>
+        <w:rPr>
+          <w:rFonts w:ascii="Times New Roman" w:eastAsia="Times New Roman" w:hAnsi="Times New Roman" w:cs="Times New Roman"/>
+          <w:i/>
+          <w:iCs/>
+          <w:sz w:val="24"/>
+          <w:szCs w:val="24"/>
+        </w:rPr>
+        <w:t>Wizard</w:t>
+      </w:r>
+      <w:proofErr w:type="spellEnd"/>
+      <w:r>
+        <w:rPr>
+          <w:rFonts w:ascii="Times New Roman" w:eastAsia="Times New Roman" w:hAnsi="Times New Roman" w:cs="Times New Roman"/>
+          <w:sz w:val="24"/>
+          <w:szCs w:val="24"/>
+        </w:rPr>
+        <w:t xml:space="preserve"> (</w:t>
+      </w:r>
+      <w:proofErr w:type="spellStart"/>
+      <w:r>
+        <w:rPr>
+          <w:rFonts w:ascii="Times New Roman" w:eastAsia="Times New Roman" w:hAnsi="Times New Roman" w:cs="Times New Roman"/>
+          <w:sz w:val="24"/>
+          <w:szCs w:val="24"/>
+        </w:rPr>
+        <w:t>Bruker</w:t>
+      </w:r>
+      <w:proofErr w:type="spellEnd"/>
+      <w:r>
+        <w:rPr>
+          <w:rFonts w:ascii="Times New Roman" w:eastAsia="Times New Roman" w:hAnsi="Times New Roman" w:cs="Times New Roman"/>
+          <w:sz w:val="24"/>
+          <w:szCs w:val="24"/>
+        </w:rPr>
+        <w:t xml:space="preserve"> </w:t>
+      </w:r>
+      <w:proofErr w:type="spellStart"/>
+      <w:r>
+        <w:rPr>
+          <w:rFonts w:ascii="Times New Roman" w:eastAsia="Times New Roman" w:hAnsi="Times New Roman" w:cs="Times New Roman"/>
+          <w:sz w:val="24"/>
+          <w:szCs w:val="24"/>
+        </w:rPr>
+        <w:t>Optik</w:t>
+      </w:r>
+      <w:proofErr w:type="spellEnd"/>
+      <w:r>
+        <w:rPr>
+          <w:rFonts w:ascii="Times New Roman" w:eastAsia="Times New Roman" w:hAnsi="Times New Roman" w:cs="Times New Roman"/>
+          <w:sz w:val="24"/>
+          <w:szCs w:val="24"/>
+        </w:rPr>
+        <w:t xml:space="preserve"> GmbH), versão 8.2 Build 8.2.28 / DB 8.2.28.242</w:t>
+      </w:r>
+      <w:r>
+        <w:rPr>
+          <w:rFonts w:ascii="Times New Roman" w:hAnsi="Times New Roman" w:cs="Times New Roman"/>
+          <w:sz w:val="24"/>
+          <w:szCs w:val="24"/>
+        </w:rPr>
+        <w:t>.</w:t>
       </w:r>
     </w:p>
     <w:p>
@@ -2199,21 +2891,192 @@
       </w:pPr>
       <w:r>
         <w:rPr>
+          <w:rFonts w:ascii="Times New Roman" w:hAnsi="Times New Roman" w:cs="Times New Roman"/>
+          <w:sz w:val="24"/>
+          <w:szCs w:val="24"/>
+        </w:rPr>
+        <w:t xml:space="preserve">Os espectros obtidos foram salvos para garantia da cadeia de custódia e rastreabilidade do material, conforme POP SENASP nº 9.09 (2024), e comparado com espectros de referência por meio do software </w:t>
+      </w:r>
+      <w:r>
+        <w:rPr>
+          <w:rFonts w:ascii="Times New Roman" w:hAnsi="Times New Roman" w:cs="Times New Roman"/>
+          <w:i/>
+          <w:iCs/>
+          <w:sz w:val="24"/>
+          <w:szCs w:val="24"/>
+        </w:rPr>
+        <w:t xml:space="preserve">OPUS </w:t>
+      </w:r>
+      <w:proofErr w:type="spellStart"/>
+      <w:r>
+        <w:rPr>
+          <w:rFonts w:ascii="Times New Roman" w:hAnsi="Times New Roman" w:cs="Times New Roman"/>
+          <w:i/>
+          <w:iCs/>
+          <w:sz w:val="24"/>
+          <w:szCs w:val="24"/>
+        </w:rPr>
+        <w:t>DrugID</w:t>
+      </w:r>
+      <w:proofErr w:type="spellEnd"/>
+      <w:r>
+        <w:rPr>
+          <w:rFonts w:ascii="Times New Roman" w:hAnsi="Times New Roman" w:cs="Times New Roman"/>
+          <w:i/>
+          <w:iCs/>
+          <w:sz w:val="24"/>
+          <w:szCs w:val="24"/>
+        </w:rPr>
+        <w:t xml:space="preserve"> </w:t>
+      </w:r>
+      <w:proofErr w:type="spellStart"/>
+      <w:r>
+        <w:rPr>
+          <w:rFonts w:ascii="Times New Roman" w:hAnsi="Times New Roman" w:cs="Times New Roman"/>
+          <w:i/>
+          <w:iCs/>
+          <w:sz w:val="24"/>
+          <w:szCs w:val="24"/>
+        </w:rPr>
+        <w:t>Wizard</w:t>
+      </w:r>
+      <w:proofErr w:type="spellEnd"/>
+      <w:r>
+        <w:rPr>
+          <w:rFonts w:ascii="Times New Roman" w:hAnsi="Times New Roman" w:cs="Times New Roman"/>
+          <w:sz w:val="24"/>
+          <w:szCs w:val="24"/>
+        </w:rPr>
+        <w:t>. A avaliação não se limitou ao índice de correspondência (</w:t>
+      </w:r>
+      <w:r>
+        <w:rPr>
+          <w:rFonts w:ascii="Times New Roman" w:hAnsi="Times New Roman" w:cs="Times New Roman"/>
+          <w:i/>
+          <w:iCs/>
+          <w:sz w:val="24"/>
+          <w:szCs w:val="24"/>
+        </w:rPr>
+        <w:t>match</w:t>
+      </w:r>
+      <w:r>
+        <w:rPr>
+          <w:rFonts w:ascii="Times New Roman" w:hAnsi="Times New Roman" w:cs="Times New Roman"/>
+          <w:sz w:val="24"/>
+          <w:szCs w:val="24"/>
+        </w:rPr>
+        <w:t xml:space="preserve">) fornecido pelo software, sendo realizada </w:t>
+      </w:r>
+      <w:r>
+        <w:rPr>
+          <w:rFonts w:ascii="Times New Roman" w:hAnsi="Times New Roman" w:cs="Times New Roman"/>
+          <w:b/>
+          <w:bCs/>
+          <w:sz w:val="24"/>
+          <w:szCs w:val="24"/>
+        </w:rPr>
+        <w:t>comparação visual obrigatória</w:t>
+      </w:r>
+      <w:r>
+        <w:rPr>
+          <w:rFonts w:ascii="Times New Roman" w:hAnsi="Times New Roman" w:cs="Times New Roman"/>
+          <w:sz w:val="24"/>
+          <w:szCs w:val="24"/>
+        </w:rPr>
+        <w:t xml:space="preserve"> conforme POP SENASP nº 9.09 (2024, §5): (i) avaliação da aparência geral do espectro; (</w:t>
+      </w:r>
+      <w:proofErr w:type="spellStart"/>
+      <w:r>
+        <w:rPr>
+          <w:rFonts w:ascii="Times New Roman" w:hAnsi="Times New Roman" w:cs="Times New Roman"/>
+          <w:sz w:val="24"/>
+          <w:szCs w:val="24"/>
+        </w:rPr>
+        <w:t>ii</w:t>
+      </w:r>
+      <w:proofErr w:type="spellEnd"/>
+      <w:r>
+        <w:rPr>
+          <w:rFonts w:ascii="Times New Roman" w:hAnsi="Times New Roman" w:cs="Times New Roman"/>
+          <w:sz w:val="24"/>
+          <w:szCs w:val="24"/>
+        </w:rPr>
+        <w:t>) identificação das bandas diagnósticas principais do padrão de referência; (</w:t>
+      </w:r>
+      <w:proofErr w:type="spellStart"/>
+      <w:r>
+        <w:rPr>
+          <w:rFonts w:ascii="Times New Roman" w:hAnsi="Times New Roman" w:cs="Times New Roman"/>
+          <w:sz w:val="24"/>
+          <w:szCs w:val="24"/>
+        </w:rPr>
+        <w:t>iii</w:t>
+      </w:r>
+      <w:proofErr w:type="spellEnd"/>
+      <w:r>
+        <w:rPr>
+          <w:rFonts w:ascii="Times New Roman" w:hAnsi="Times New Roman" w:cs="Times New Roman"/>
+          <w:sz w:val="24"/>
+          <w:szCs w:val="24"/>
+        </w:rPr>
+        <w:t>) localização dessas bandas no espectro questionado (tolerância ±4 cm⁻¹).</w:t>
+      </w:r>
+      <w:r>
+        <w:rPr>
+          <w:rStyle w:val="Refdenotaderodap"/>
+          <w:rFonts w:ascii="Times New Roman" w:hAnsi="Times New Roman" w:cs="Times New Roman"/>
+          <w:sz w:val="24"/>
+          <w:szCs w:val="24"/>
+        </w:rPr>
+        <w:footnoteReference w:id="4"/>
+      </w:r>
+      <w:r>
+        <w:rPr>
+          <w:rFonts w:ascii="Times New Roman" w:hAnsi="Times New Roman" w:cs="Times New Roman"/>
+          <w:sz w:val="24"/>
+          <w:szCs w:val="24"/>
+        </w:rPr>
+        <w:t xml:space="preserve"> </w:t>
+      </w:r>
+      <w:r>
+        <w:rPr>
+          <w:rFonts w:ascii="Times New Roman" w:eastAsia="Times New Roman" w:hAnsi="Times New Roman" w:cs="Times New Roman"/>
+          <w:sz w:val="24"/>
+          <w:szCs w:val="24"/>
+        </w:rPr>
+        <w:t>A tolerância declarada de ±4 cm⁻¹ é tecnicamente conservadora em relação à exatidão de número de onda verificada instrumentalmente pelo OVP vigente (desvio medido: 0,28 cm⁻¹), conferindo margem analítica adicional de segurança às identificações realizadas.</w:t>
+      </w:r>
+    </w:p>
+    <w:p>
+      <w:pPr>
+        <w:spacing w:before="80" w:after="80"/>
+        <w:jc w:val="both"/>
+        <w:rPr>
+          <w:rFonts w:ascii="Times New Roman" w:hAnsi="Times New Roman" w:cs="Times New Roman"/>
+          <w:i/>
+          <w:iCs/>
+          <w:sz w:val="20"/>
+          <w:szCs w:val="20"/>
+        </w:rPr>
+      </w:pPr>
+      <w:r>
+        <w:rPr>
           <w:noProof/>
         </w:rPr>
+        <w:lastRenderedPageBreak/>
         <w:drawing>
-          <wp:anchor distT="0" distB="0" distL="114300" distR="114300" simplePos="0" relativeHeight="251659264" behindDoc="0" locked="0" layoutInCell="1" allowOverlap="1" wp14:anchorId="6F6C15E3" wp14:editId="7A08EEB3">
+          <wp:anchor distT="0" distB="0" distL="114300" distR="114300" simplePos="0" relativeHeight="251661312" behindDoc="0" locked="0" layoutInCell="1" allowOverlap="1" wp14:anchorId="2D1108A9" wp14:editId="34AF98DA">
             <wp:simplePos x="0" y="0"/>
             <wp:positionH relativeFrom="margin">
               <wp:align>center</wp:align>
             </wp:positionH>
             <wp:positionV relativeFrom="paragraph">
-              <wp:posOffset>1444625</wp:posOffset>
+              <wp:posOffset>189865</wp:posOffset>
             </wp:positionV>
             <wp:extent cx="3960495" cy="2238375"/>
             <wp:effectExtent l="19050" t="19050" r="20955" b="28575"/>
             <wp:wrapTopAndBottom/>
-            <wp:docPr id="7" name="Imagem 7"/>
+            <wp:docPr id="2" name="Imagem 2"/>
             <wp:cNvGraphicFramePr>
               <a:graphicFrameLocks xmlns:a="http://schemas.openxmlformats.org/drawingml/2006/main" noChangeAspect="1"/>
             </wp:cNvGraphicFramePr>
@@ -2267,82 +3130,10 @@
           </wp:anchor>
         </w:drawing>
       </w:r>
-      <w:r>
-        <w:rPr>
-          <w:rFonts w:ascii="Times New Roman" w:hAnsi="Times New Roman" w:cs="Times New Roman"/>
-          <w:sz w:val="24"/>
-          <w:szCs w:val="24"/>
-        </w:rPr>
-        <w:t xml:space="preserve">Os espectros obtidos foram salvos para garantia da cadeia de custódia e rastreabilidade do material, conforme POP SENASP nº 9.09 (2024), e comparado com espectros de referência por meio do software </w:t>
-      </w:r>
-      <w:r>
-        <w:rPr>
-          <w:rFonts w:ascii="Times New Roman" w:hAnsi="Times New Roman" w:cs="Times New Roman"/>
-          <w:i/>
-          <w:iCs/>
-          <w:sz w:val="24"/>
-          <w:szCs w:val="24"/>
-        </w:rPr>
-        <w:t>OPUS DrugID Wizard</w:t>
-      </w:r>
-      <w:r>
-        <w:rPr>
-          <w:rFonts w:ascii="Times New Roman" w:hAnsi="Times New Roman" w:cs="Times New Roman"/>
-          <w:sz w:val="24"/>
-          <w:szCs w:val="24"/>
-        </w:rPr>
-        <w:t>. A avaliação não se limitou ao índice de correspondência (</w:t>
-      </w:r>
-      <w:r>
-        <w:rPr>
-          <w:rFonts w:ascii="Times New Roman" w:hAnsi="Times New Roman" w:cs="Times New Roman"/>
-          <w:i/>
-          <w:iCs/>
-          <w:sz w:val="24"/>
-          <w:szCs w:val="24"/>
-        </w:rPr>
-        <w:t>match</w:t>
-      </w:r>
-      <w:r>
-        <w:rPr>
-          <w:rFonts w:ascii="Times New Roman" w:hAnsi="Times New Roman" w:cs="Times New Roman"/>
-          <w:sz w:val="24"/>
-          <w:szCs w:val="24"/>
-        </w:rPr>
-        <w:t xml:space="preserve">) fornecido pelo software, sendo realizada </w:t>
-      </w:r>
-      <w:r>
-        <w:rPr>
-          <w:rFonts w:ascii="Times New Roman" w:hAnsi="Times New Roman" w:cs="Times New Roman"/>
-          <w:b/>
-          <w:bCs/>
-          <w:sz w:val="24"/>
-          <w:szCs w:val="24"/>
-        </w:rPr>
-        <w:t>comparação visual obrigatória</w:t>
-      </w:r>
-      <w:r>
-        <w:rPr>
-          <w:rFonts w:ascii="Times New Roman" w:hAnsi="Times New Roman" w:cs="Times New Roman"/>
-          <w:sz w:val="24"/>
-          <w:szCs w:val="24"/>
-        </w:rPr>
-        <w:t xml:space="preserve"> conforme POP SENASP nº 9.09 (2024, §5): (i) avaliação da aparência geral do espectro; (ii) identificação das bandas diagnósticas principais do padrão de referência; (iii) localização dessas bandas no espectro questionado (tolerância ±4 cm⁻¹).</w:t>
-      </w:r>
-      <w:r>
-        <w:rPr>
-          <w:rStyle w:val="Refdenotaderodap"/>
-          <w:rFonts w:ascii="Times New Roman" w:hAnsi="Times New Roman" w:cs="Times New Roman"/>
-          <w:sz w:val="24"/>
-          <w:szCs w:val="24"/>
-        </w:rPr>
-        <w:footnoteReference w:id="4"/>
-      </w:r>
-    </w:p>
-    <w:p>
-      <w:pPr>
-        <w:spacing w:before="80" w:after="80"/>
-        <w:jc w:val="both"/>
+    </w:p>
+    <w:p>
+      <w:pPr>
+        <w:jc w:val="center"/>
         <w:rPr>
           <w:rFonts w:ascii="Times New Roman" w:hAnsi="Times New Roman" w:cs="Times New Roman"/>
           <w:i/>
@@ -2351,10 +3142,7 @@
           <w:szCs w:val="20"/>
         </w:rPr>
       </w:pPr>
-    </w:p>
-    <w:p>
-      <w:pPr>
-        <w:jc w:val="center"/>
+      <w:r>
         <w:rPr>
           <w:rFonts w:ascii="Times New Roman" w:hAnsi="Times New Roman" w:cs="Times New Roman"/>
           <w:i/>
@@ -2362,15 +3150,6 @@
           <w:sz w:val="20"/>
           <w:szCs w:val="20"/>
         </w:rPr>
-      </w:pPr>
-      <w:r>
-        <w:rPr>
-          <w:rFonts w:ascii="Times New Roman" w:hAnsi="Times New Roman" w:cs="Times New Roman"/>
-          <w:i/>
-          <w:iCs/>
-          <w:sz w:val="20"/>
-          <w:szCs w:val="20"/>
-        </w:rPr>
         <w:t>Esquema didático de funcionamento do FTIR-ATR.</w:t>
       </w:r>
     </w:p>
@@ -2433,7 +3212,6 @@
           <w:sz w:val="24"/>
           <w:szCs w:val="24"/>
         </w:rPr>
-        <w:lastRenderedPageBreak/>
         <w:t>Fast Blue B:</w:t>
       </w:r>
       <w:r>
@@ -2462,15 +3240,73 @@
           <w:sz w:val="24"/>
           <w:szCs w:val="24"/>
         </w:rPr>
-        <w:t>PRESUNTIVO POSITIVO para canabinoide fenólico</w:t>
-      </w:r>
-      <w:r>
-        <w:rPr>
-          <w:rFonts w:ascii="Times New Roman" w:eastAsia="Times New Roman" w:hAnsi="Times New Roman" w:cs="Times New Roman"/>
-          <w:sz w:val="24"/>
-          <w:szCs w:val="24"/>
-        </w:rPr>
-        <w:t>, evidenciado pela formação de coloração vermelho-avermelhada intensa e estável na fase orgânica hexânica, compatível com produto de acoplamento azoaromático do Δ9-THC.</w:t>
+        <w:t xml:space="preserve">PRESUNTIVO POSITIVO para </w:t>
+      </w:r>
+      <w:proofErr w:type="spellStart"/>
+      <w:r>
+        <w:rPr>
+          <w:rFonts w:ascii="Times New Roman" w:eastAsia="Times New Roman" w:hAnsi="Times New Roman" w:cs="Times New Roman"/>
+          <w:b/>
+          <w:bCs/>
+          <w:sz w:val="24"/>
+          <w:szCs w:val="24"/>
+        </w:rPr>
+        <w:t>canabinoide</w:t>
+      </w:r>
+      <w:proofErr w:type="spellEnd"/>
+      <w:r>
+        <w:rPr>
+          <w:rFonts w:ascii="Times New Roman" w:eastAsia="Times New Roman" w:hAnsi="Times New Roman" w:cs="Times New Roman"/>
+          <w:b/>
+          <w:bCs/>
+          <w:sz w:val="24"/>
+          <w:szCs w:val="24"/>
+        </w:rPr>
+        <w:t xml:space="preserve"> fenólico</w:t>
+      </w:r>
+      <w:r>
+        <w:rPr>
+          <w:rFonts w:ascii="Times New Roman" w:eastAsia="Times New Roman" w:hAnsi="Times New Roman" w:cs="Times New Roman"/>
+          <w:sz w:val="24"/>
+          <w:szCs w:val="24"/>
+        </w:rPr>
+        <w:t xml:space="preserve">, evidenciado pela formação de coloração </w:t>
+      </w:r>
+      <w:proofErr w:type="spellStart"/>
+      <w:r>
+        <w:rPr>
+          <w:rFonts w:ascii="Times New Roman" w:eastAsia="Times New Roman" w:hAnsi="Times New Roman" w:cs="Times New Roman"/>
+          <w:sz w:val="24"/>
+          <w:szCs w:val="24"/>
+        </w:rPr>
+        <w:t>vermelho-avermelhada</w:t>
+      </w:r>
+      <w:proofErr w:type="spellEnd"/>
+      <w:r>
+        <w:rPr>
+          <w:rFonts w:ascii="Times New Roman" w:eastAsia="Times New Roman" w:hAnsi="Times New Roman" w:cs="Times New Roman"/>
+          <w:sz w:val="24"/>
+          <w:szCs w:val="24"/>
+        </w:rPr>
+        <w:t xml:space="preserve"> intensa e estável na fase orgânica </w:t>
+      </w:r>
+      <w:proofErr w:type="spellStart"/>
+      <w:r>
+        <w:rPr>
+          <w:rFonts w:ascii="Times New Roman" w:eastAsia="Times New Roman" w:hAnsi="Times New Roman" w:cs="Times New Roman"/>
+          <w:sz w:val="24"/>
+          <w:szCs w:val="24"/>
+        </w:rPr>
+        <w:t>hexânica</w:t>
+      </w:r>
+      <w:proofErr w:type="spellEnd"/>
+      <w:r>
+        <w:rPr>
+          <w:rFonts w:ascii="Times New Roman" w:eastAsia="Times New Roman" w:hAnsi="Times New Roman" w:cs="Times New Roman"/>
+          <w:sz w:val="24"/>
+          <w:szCs w:val="24"/>
+        </w:rPr>
+        <w:t>, compatível com produto de acoplamento azoaromático do Δ9-THC.</w:t>
       </w:r>
     </w:p>
     <w:p>
@@ -2562,7 +3398,27 @@
           <w:sz w:val="24"/>
           <w:szCs w:val="24"/>
         </w:rPr>
-        <w:t>(ii)</w:t>
+        <w:t>(</w:t>
+      </w:r>
+      <w:proofErr w:type="spellStart"/>
+      <w:r>
+        <w:rPr>
+          <w:rFonts w:ascii="Times New Roman" w:hAnsi="Times New Roman" w:cs="Times New Roman"/>
+          <w:b/>
+          <w:sz w:val="24"/>
+          <w:szCs w:val="24"/>
+        </w:rPr>
+        <w:t>ii</w:t>
+      </w:r>
+      <w:proofErr w:type="spellEnd"/>
+      <w:r>
+        <w:rPr>
+          <w:rFonts w:ascii="Times New Roman" w:hAnsi="Times New Roman" w:cs="Times New Roman"/>
+          <w:b/>
+          <w:sz w:val="24"/>
+          <w:szCs w:val="24"/>
+        </w:rPr>
+        <w:t>)</w:t>
       </w:r>
       <w:r>
         <w:rPr>
@@ -2579,7 +3435,27 @@
           <w:sz w:val="24"/>
           <w:szCs w:val="24"/>
         </w:rPr>
-        <w:t>(iii)</w:t>
+        <w:t>(</w:t>
+      </w:r>
+      <w:proofErr w:type="spellStart"/>
+      <w:r>
+        <w:rPr>
+          <w:rFonts w:ascii="Times New Roman" w:hAnsi="Times New Roman" w:cs="Times New Roman"/>
+          <w:b/>
+          <w:sz w:val="24"/>
+          <w:szCs w:val="24"/>
+        </w:rPr>
+        <w:t>iii</w:t>
+      </w:r>
+      <w:proofErr w:type="spellEnd"/>
+      <w:r>
+        <w:rPr>
+          <w:rFonts w:ascii="Times New Roman" w:hAnsi="Times New Roman" w:cs="Times New Roman"/>
+          <w:b/>
+          <w:sz w:val="24"/>
+          <w:szCs w:val="24"/>
+        </w:rPr>
+        <w:t>)</w:t>
       </w:r>
       <w:r>
         <w:rPr>
@@ -2670,8 +3546,42 @@
           <w:sz w:val="24"/>
           <w:szCs w:val="24"/>
         </w:rPr>
-        <w:t>OPUS DrugID Wizard</w:t>
-      </w:r>
+        <w:t xml:space="preserve">OPUS </w:t>
+      </w:r>
+      <w:proofErr w:type="spellStart"/>
+      <w:r>
+        <w:rPr>
+          <w:rFonts w:ascii="Times New Roman" w:eastAsia="Times New Roman" w:hAnsi="Times New Roman" w:cs="Times New Roman"/>
+          <w:i/>
+          <w:iCs/>
+          <w:sz w:val="24"/>
+          <w:szCs w:val="24"/>
+        </w:rPr>
+        <w:t>DrugID</w:t>
+      </w:r>
+      <w:proofErr w:type="spellEnd"/>
+      <w:r>
+        <w:rPr>
+          <w:rFonts w:ascii="Times New Roman" w:eastAsia="Times New Roman" w:hAnsi="Times New Roman" w:cs="Times New Roman"/>
+          <w:i/>
+          <w:iCs/>
+          <w:sz w:val="24"/>
+          <w:szCs w:val="24"/>
+        </w:rPr>
+        <w:t xml:space="preserve"> </w:t>
+      </w:r>
+      <w:proofErr w:type="spellStart"/>
+      <w:r>
+        <w:rPr>
+          <w:rFonts w:ascii="Times New Roman" w:eastAsia="Times New Roman" w:hAnsi="Times New Roman" w:cs="Times New Roman"/>
+          <w:i/>
+          <w:iCs/>
+          <w:sz w:val="24"/>
+          <w:szCs w:val="24"/>
+        </w:rPr>
+        <w:t>Wizard</w:t>
+      </w:r>
+      <w:proofErr w:type="spellEnd"/>
       <w:r>
         <w:rPr>
           <w:rFonts w:ascii="Times New Roman" w:eastAsia="Times New Roman" w:hAnsi="Times New Roman" w:cs="Times New Roman"/>
@@ -2706,7 +3616,29 @@
           <w:sz w:val="24"/>
           <w:szCs w:val="24"/>
         </w:rPr>
-        <w:t>(-)-(6aR,10aR)-6,6,9-trimetil-3-pentil-6a,7,8,10a-tetrahidro-6H-benzo[c]piran-1-ol</w:t>
+        <w:t>(</w:t>
+      </w:r>
+      <w:proofErr w:type="gramStart"/>
+      <w:r>
+        <w:rPr>
+          <w:rFonts w:ascii="Times New Roman" w:eastAsia="Times New Roman" w:hAnsi="Times New Roman" w:cs="Times New Roman"/>
+          <w:i/>
+          <w:iCs/>
+          <w:sz w:val="24"/>
+          <w:szCs w:val="24"/>
+        </w:rPr>
+        <w:t>-)-(</w:t>
+      </w:r>
+      <w:proofErr w:type="gramEnd"/>
+      <w:r>
+        <w:rPr>
+          <w:rFonts w:ascii="Times New Roman" w:eastAsia="Times New Roman" w:hAnsi="Times New Roman" w:cs="Times New Roman"/>
+          <w:i/>
+          <w:iCs/>
+          <w:sz w:val="24"/>
+          <w:szCs w:val="24"/>
+        </w:rPr>
+        <w:t>6aR,10aR)-6,6,9-trimetil-3-pentil-6a,7,8,10a-tetrahidro-6H-benzoc.piran-1-ol</w:t>
       </w:r>
       <w:r>
         <w:rPr>
@@ -2878,7 +3810,29 @@
                 <w:sz w:val="20"/>
                 <w:szCs w:val="20"/>
               </w:rPr>
-              <w:t>ν O–H fenólico — BANDA DIAGNÓSTICA PRIMÁRIA: ausente em canabinoides sem OH fenólico livre (THCA, CBC)</w:t>
+              <w:t xml:space="preserve">ν O–H fenólico — BANDA DIAGNÓSTICA PRIMÁRIA: ausente em </w:t>
+            </w:r>
+            <w:proofErr w:type="spellStart"/>
+            <w:r>
+              <w:rPr>
+                <w:rFonts w:ascii="Times New Roman" w:eastAsia="Times New Roman" w:hAnsi="Times New Roman" w:cs="Times New Roman"/>
+                <w:b/>
+                <w:bCs/>
+                <w:sz w:val="20"/>
+                <w:szCs w:val="20"/>
+              </w:rPr>
+              <w:t>canabinoides</w:t>
+            </w:r>
+            <w:proofErr w:type="spellEnd"/>
+            <w:r>
+              <w:rPr>
+                <w:rFonts w:ascii="Times New Roman" w:eastAsia="Times New Roman" w:hAnsi="Times New Roman" w:cs="Times New Roman"/>
+                <w:b/>
+                <w:bCs/>
+                <w:sz w:val="20"/>
+                <w:szCs w:val="20"/>
+              </w:rPr>
+              <w:t xml:space="preserve"> sem OH fenólico livre (THCA, CBC)</w:t>
             </w:r>
           </w:p>
         </w:tc>
@@ -2961,8 +3915,18 @@
                 <w:sz w:val="20"/>
                 <w:szCs w:val="20"/>
               </w:rPr>
-              <w:t>ν C=C aromático — anel resorcinólico</w:t>
-            </w:r>
+              <w:t xml:space="preserve">ν C=C aromático — anel </w:t>
+            </w:r>
+            <w:proofErr w:type="spellStart"/>
+            <w:r>
+              <w:rPr>
+                <w:rFonts w:ascii="Times New Roman" w:eastAsia="Times New Roman" w:hAnsi="Times New Roman" w:cs="Times New Roman"/>
+                <w:sz w:val="20"/>
+                <w:szCs w:val="20"/>
+              </w:rPr>
+              <w:t>resorcinólico</w:t>
+            </w:r>
+            <w:proofErr w:type="spellEnd"/>
           </w:p>
         </w:tc>
         <w:tc>
@@ -3220,7 +4184,29 @@
                 <w:sz w:val="20"/>
                 <w:szCs w:val="20"/>
               </w:rPr>
-              <w:t>ν C–O–C éter cíclico — ponte de oxigênio do anel cromeno; diferencia THC de fenóis simples</w:t>
+              <w:t xml:space="preserve">ν C–O–C éter cíclico — ponte de oxigênio do anel </w:t>
+            </w:r>
+            <w:proofErr w:type="spellStart"/>
+            <w:r>
+              <w:rPr>
+                <w:rFonts w:ascii="Times New Roman" w:eastAsia="Times New Roman" w:hAnsi="Times New Roman" w:cs="Times New Roman"/>
+                <w:b/>
+                <w:bCs/>
+                <w:sz w:val="20"/>
+                <w:szCs w:val="20"/>
+              </w:rPr>
+              <w:t>cromeno</w:t>
+            </w:r>
+            <w:proofErr w:type="spellEnd"/>
+            <w:r>
+              <w:rPr>
+                <w:rFonts w:ascii="Times New Roman" w:eastAsia="Times New Roman" w:hAnsi="Times New Roman" w:cs="Times New Roman"/>
+                <w:b/>
+                <w:bCs/>
+                <w:sz w:val="20"/>
+                <w:szCs w:val="20"/>
+              </w:rPr>
+              <w:t>; diferencia THC de fenóis simples</w:t>
             </w:r>
           </w:p>
         </w:tc>
@@ -3303,7 +4289,43 @@
                 <w:sz w:val="20"/>
                 <w:szCs w:val="20"/>
               </w:rPr>
-              <w:t>ν C–H alifático — cadeia alquil lateral (pentil)</w:t>
+              <w:t xml:space="preserve">ν C–H alifático — cadeia </w:t>
+            </w:r>
+            <w:proofErr w:type="spellStart"/>
+            <w:r>
+              <w:rPr>
+                <w:rFonts w:ascii="Times New Roman" w:eastAsia="Times New Roman" w:hAnsi="Times New Roman" w:cs="Times New Roman"/>
+                <w:sz w:val="20"/>
+                <w:szCs w:val="20"/>
+              </w:rPr>
+              <w:t>alquil</w:t>
+            </w:r>
+            <w:proofErr w:type="spellEnd"/>
+            <w:r>
+              <w:rPr>
+                <w:rFonts w:ascii="Times New Roman" w:eastAsia="Times New Roman" w:hAnsi="Times New Roman" w:cs="Times New Roman"/>
+                <w:sz w:val="20"/>
+                <w:szCs w:val="20"/>
+              </w:rPr>
+              <w:t xml:space="preserve"> lateral (</w:t>
+            </w:r>
+            <w:proofErr w:type="spellStart"/>
+            <w:r>
+              <w:rPr>
+                <w:rFonts w:ascii="Times New Roman" w:eastAsia="Times New Roman" w:hAnsi="Times New Roman" w:cs="Times New Roman"/>
+                <w:sz w:val="20"/>
+                <w:szCs w:val="20"/>
+              </w:rPr>
+              <w:t>pentil</w:t>
+            </w:r>
+            <w:proofErr w:type="spellEnd"/>
+            <w:r>
+              <w:rPr>
+                <w:rFonts w:ascii="Times New Roman" w:eastAsia="Times New Roman" w:hAnsi="Times New Roman" w:cs="Times New Roman"/>
+                <w:sz w:val="20"/>
+                <w:szCs w:val="20"/>
+              </w:rPr>
+              <w:t>)</w:t>
             </w:r>
           </w:p>
         </w:tc>
@@ -3430,6 +4452,7 @@
                 <w:sz w:val="20"/>
                 <w:szCs w:val="20"/>
               </w:rPr>
+              <w:lastRenderedPageBreak/>
               <w:t>~1375 e ~1460</w:t>
             </w:r>
           </w:p>
@@ -3469,7 +4492,43 @@
                 <w:sz w:val="20"/>
                 <w:szCs w:val="20"/>
               </w:rPr>
-              <w:t>δ CH₃ simétrico e antissimétrico — grupos metila gem-dimetil (C6) e isopropenila (C9)</w:t>
+              <w:t xml:space="preserve">δ CH₃ simétrico e antissimétrico — grupos metila </w:t>
+            </w:r>
+            <w:proofErr w:type="spellStart"/>
+            <w:r>
+              <w:rPr>
+                <w:rFonts w:ascii="Times New Roman" w:eastAsia="Times New Roman" w:hAnsi="Times New Roman" w:cs="Times New Roman"/>
+                <w:sz w:val="20"/>
+                <w:szCs w:val="20"/>
+              </w:rPr>
+              <w:t>gem</w:t>
+            </w:r>
+            <w:proofErr w:type="spellEnd"/>
+            <w:r>
+              <w:rPr>
+                <w:rFonts w:ascii="Times New Roman" w:eastAsia="Times New Roman" w:hAnsi="Times New Roman" w:cs="Times New Roman"/>
+                <w:sz w:val="20"/>
+                <w:szCs w:val="20"/>
+              </w:rPr>
+              <w:t xml:space="preserve">-dimetil (C6) e </w:t>
+            </w:r>
+            <w:proofErr w:type="spellStart"/>
+            <w:r>
+              <w:rPr>
+                <w:rFonts w:ascii="Times New Roman" w:eastAsia="Times New Roman" w:hAnsi="Times New Roman" w:cs="Times New Roman"/>
+                <w:sz w:val="20"/>
+                <w:szCs w:val="20"/>
+              </w:rPr>
+              <w:t>isopropenila</w:t>
+            </w:r>
+            <w:proofErr w:type="spellEnd"/>
+            <w:r>
+              <w:rPr>
+                <w:rFonts w:ascii="Times New Roman" w:eastAsia="Times New Roman" w:hAnsi="Times New Roman" w:cs="Times New Roman"/>
+                <w:sz w:val="20"/>
+                <w:szCs w:val="20"/>
+              </w:rPr>
+              <w:t xml:space="preserve"> (C9)</w:t>
             </w:r>
           </w:p>
         </w:tc>
@@ -3516,7 +4575,29 @@
           <w:sz w:val="20"/>
           <w:szCs w:val="20"/>
         </w:rPr>
-        <w:t>Tabela 5. Bandas espectrais diagnósticas — FTIR-ATR — Δ9-THC. Bandas destacadas (ν O–H fenólico + ν C–O fenólico + ν C–O–C éter cíclico) são altamente específicas para Δ9-THC. Adaptado de UNODC (2009) e Moffat et al. (2011).</w:t>
+        <w:t xml:space="preserve">Tabela 5. Bandas espectrais diagnósticas — FTIR-ATR — Δ9-THC. Bandas destacadas (ν O–H fenólico + ν C–O fenólico + ν C–O–C éter cíclico) são altamente específicas para Δ9-THC. Adaptado de UNODC (2009) e </w:t>
+      </w:r>
+      <w:proofErr w:type="spellStart"/>
+      <w:r>
+        <w:rPr>
+          <w:rFonts w:ascii="Times New Roman" w:eastAsia="Times New Roman" w:hAnsi="Times New Roman" w:cs="Times New Roman"/>
+          <w:i/>
+          <w:iCs/>
+          <w:sz w:val="20"/>
+          <w:szCs w:val="20"/>
+        </w:rPr>
+        <w:t>Moffat</w:t>
+      </w:r>
+      <w:proofErr w:type="spellEnd"/>
+      <w:r>
+        <w:rPr>
+          <w:rFonts w:ascii="Times New Roman" w:eastAsia="Times New Roman" w:hAnsi="Times New Roman" w:cs="Times New Roman"/>
+          <w:i/>
+          <w:iCs/>
+          <w:sz w:val="20"/>
+          <w:szCs w:val="20"/>
+        </w:rPr>
+        <w:t xml:space="preserve"> et al. (2011).</w:t>
       </w:r>
     </w:p>
     <w:p>
@@ -3529,7 +4610,7 @@
           <w:noProof/>
         </w:rPr>
         <w:drawing>
-          <wp:inline distT="0" distB="0" distL="0" distR="0" wp14:anchorId="435C51FE" wp14:editId="25534A2F">
+          <wp:inline distT="0" distB="0" distL="0" distR="0" wp14:anchorId="035E3564" wp14:editId="5032FA52">
             <wp:extent cx="2482850" cy="1316263"/>
             <wp:effectExtent l="0" t="0" r="0" b="0"/>
             <wp:docPr id="5" name="Imagem 5" descr="Molécula do tetra-hidrocarbinol (THC)"/>
@@ -3650,7 +4731,6 @@
           <w:sz w:val="24"/>
           <w:szCs w:val="24"/>
         </w:rPr>
-        <w:lastRenderedPageBreak/>
         <w:t>Com fundamento nos exames realizados — ensaios colorimétricos presuntivos (</w:t>
       </w:r>
       <w:r>
@@ -3946,7 +5026,29 @@
                 <w:sz w:val="24"/>
                 <w:szCs w:val="24"/>
               </w:rPr>
-              <w:t xml:space="preserve"> — Cannabis e seus derivados, de uso proscrito no Brasil da Portaria SVS/MS nº 344, de 12/05/1998 e atualizações posteriores (ANVISA). </w:t>
+              <w:t xml:space="preserve"> — </w:t>
+            </w:r>
+            <w:r>
+              <w:rPr>
+                <w:rFonts w:ascii="Times New Roman" w:eastAsia="Times New Roman" w:hAnsi="Times New Roman" w:cs="Times New Roman"/>
+                <w:b w:val="0"/>
+                <w:bCs w:val="0"/>
+                <w:i/>
+                <w:iCs/>
+                <w:sz w:val="24"/>
+                <w:szCs w:val="24"/>
+              </w:rPr>
+              <w:t>Cannabis</w:t>
+            </w:r>
+            <w:r>
+              <w:rPr>
+                <w:rFonts w:ascii="Times New Roman" w:eastAsia="Times New Roman" w:hAnsi="Times New Roman" w:cs="Times New Roman"/>
+                <w:b w:val="0"/>
+                <w:bCs w:val="0"/>
+                <w:sz w:val="24"/>
+                <w:szCs w:val="24"/>
+              </w:rPr>
+              <w:t xml:space="preserve"> e seus derivados, de uso proscrito no Brasil da Portaria SVS/MS nº 344, de 12/05/1998 e atualizações posteriores (ANVISA). </w:t>
             </w:r>
           </w:p>
         </w:tc>
@@ -4266,7 +5368,15 @@
                 <w:sz w:val="20"/>
                 <w:szCs w:val="20"/>
               </w:rPr>
-              <w:t>[DD de MÊS de ANO]</w:t>
+              <w:t>14</w:t>
+            </w:r>
+            <w:r>
+              <w:rPr>
+                <w:rFonts w:ascii="Times New Roman" w:hAnsi="Times New Roman" w:cs="Times New Roman"/>
+                <w:sz w:val="20"/>
+                <w:szCs w:val="20"/>
+              </w:rPr>
+              <w:t xml:space="preserve"> de maio de 2026</w:t>
             </w:r>
           </w:p>
         </w:tc>
@@ -4370,7 +5480,7 @@
                 <w:sz w:val="20"/>
                 <w:szCs w:val="20"/>
               </w:rPr>
-              <w:t>BO [BO] / APF [APF]</w:t>
+              <w:t>BO [BO]</w:t>
             </w:r>
           </w:p>
         </w:tc>
@@ -4502,6 +5612,7 @@
           <w:b/>
           <w:bCs/>
         </w:rPr>
+        <w:lastRenderedPageBreak/>
         <w:t>Cadeia de Custódia — Sistema AMPLO</w:t>
       </w:r>
     </w:p>
@@ -4666,7 +5777,7 @@
                 <w:sz w:val="20"/>
                 <w:szCs w:val="20"/>
               </w:rPr>
-              <w:t>[DD de MÊS de ANO]</w:t>
+              <w:t>[DD] de [MÊS] de [ANO]</w:t>
             </w:r>
           </w:p>
         </w:tc>
@@ -5292,7 +6403,6 @@
                 <w:sz w:val="20"/>
                 <w:szCs w:val="20"/>
               </w:rPr>
-              <w:lastRenderedPageBreak/>
               <w:t>Data de conclusão</w:t>
             </w:r>
           </w:p>
@@ -5375,7 +6485,25 @@
           <w:sz w:val="16"/>
           <w:szCs w:val="16"/>
         </w:rPr>
-        <w:t>Análise forense: pesquisa de drogas vegetais interferentes de testes colorimétricos para identificação dos canabinoides da maconha (Cannabis sativa L.). Química Nova, São Paulo, v. 35, n. 10, p. 2040–2043, 2012.</w:t>
+        <w:t xml:space="preserve">Análise forense: pesquisa de drogas vegetais interferentes de testes colorimétricos para identificação dos </w:t>
+      </w:r>
+      <w:proofErr w:type="spellStart"/>
+      <w:r>
+        <w:rPr>
+          <w:rFonts w:ascii="Times New Roman" w:eastAsia="Times New Roman" w:hAnsi="Times New Roman" w:cs="Times New Roman"/>
+          <w:sz w:val="16"/>
+          <w:szCs w:val="16"/>
+        </w:rPr>
+        <w:t>canabinoides</w:t>
+      </w:r>
+      <w:proofErr w:type="spellEnd"/>
+      <w:r>
+        <w:rPr>
+          <w:rFonts w:ascii="Times New Roman" w:eastAsia="Times New Roman" w:hAnsi="Times New Roman" w:cs="Times New Roman"/>
+          <w:sz w:val="16"/>
+          <w:szCs w:val="16"/>
+        </w:rPr>
+        <w:t xml:space="preserve"> da maconha (Cannabis sativa L.). Química Nova, São Paulo, v. 35, n. 10, p. 2040–2043, 2012.</w:t>
       </w:r>
     </w:p>
     <w:p>
@@ -5512,7 +6640,27 @@
           <w:szCs w:val="16"/>
           <w:lang w:val="en-US"/>
         </w:rPr>
-        <w:t>BRUKER OPTICS. Alpha II FTIR Spectrometer: technical manual. [S.l.]: Bruker, 2020.</w:t>
+        <w:t>BRUKER OPTICS. Alpha II FTIR Spectrometer: technical manual. [</w:t>
+      </w:r>
+      <w:proofErr w:type="spellStart"/>
+      <w:r>
+        <w:rPr>
+          <w:rFonts w:ascii="Times New Roman" w:hAnsi="Times New Roman" w:cs="Times New Roman"/>
+          <w:sz w:val="16"/>
+          <w:szCs w:val="16"/>
+          <w:lang w:val="en-US"/>
+        </w:rPr>
+        <w:t>S.l.</w:t>
+      </w:r>
+      <w:proofErr w:type="spellEnd"/>
+      <w:r>
+        <w:rPr>
+          <w:rFonts w:ascii="Times New Roman" w:hAnsi="Times New Roman" w:cs="Times New Roman"/>
+          <w:sz w:val="16"/>
+          <w:szCs w:val="16"/>
+          <w:lang w:val="en-US"/>
+        </w:rPr>
+        <w:t>]: Bruker, 2020.</w:t>
       </w:r>
     </w:p>
     <w:p>
@@ -5539,7 +6687,27 @@
           <w:szCs w:val="16"/>
           <w:lang w:val="en-US"/>
         </w:rPr>
-        <w:t>CASALE, J. F. et al. Four new illicit cocaine impurities from the oxidation of crude cocaine base: formation and characterization of the diastereomeric 2,3-dihydroxy-3-phenylpropionylecgonine methyl esters from cis- and trans-cinnamoylcocaine. Journal of Forensic Science, v. 52, n. 4, p. 860–866, 2007.</w:t>
+        <w:t>CASALE, J. F. et al. Four new illicit cocaine impurities from the oxidation of crude cocaine base: formation and characterization of the diastereomeric 2,3-dihydroxy-3-phenylpropionylecgonine methyl esters from cis- and trans-</w:t>
+      </w:r>
+      <w:proofErr w:type="spellStart"/>
+      <w:r>
+        <w:rPr>
+          <w:rFonts w:ascii="Times New Roman" w:hAnsi="Times New Roman" w:cs="Times New Roman"/>
+          <w:sz w:val="16"/>
+          <w:szCs w:val="16"/>
+          <w:lang w:val="en-US"/>
+        </w:rPr>
+        <w:t>cinnamoylcocaine</w:t>
+      </w:r>
+      <w:proofErr w:type="spellEnd"/>
+      <w:r>
+        <w:rPr>
+          <w:rFonts w:ascii="Times New Roman" w:hAnsi="Times New Roman" w:cs="Times New Roman"/>
+          <w:sz w:val="16"/>
+          <w:szCs w:val="16"/>
+          <w:lang w:val="en-US"/>
+        </w:rPr>
+        <w:t>. Journal of Forensic Science, v. 52, n. 4, p. 860–866, 2007.</w:t>
       </w:r>
     </w:p>
     <w:p>
@@ -5675,7 +6843,27 @@
           <w:szCs w:val="16"/>
           <w:lang w:val="en-US"/>
         </w:rPr>
-        <w:t>MALDANER, A. O. et al. Brazilian Federal Police drug chemical profiling — The PeQui Project. Science and Justice, v. 54, p. 300–306, 2014.</w:t>
+        <w:t xml:space="preserve">MALDANER, A. O. et al. Brazilian Federal Police drug chemical profiling — The </w:t>
+      </w:r>
+      <w:proofErr w:type="spellStart"/>
+      <w:r>
+        <w:rPr>
+          <w:rFonts w:ascii="Times New Roman" w:hAnsi="Times New Roman" w:cs="Times New Roman"/>
+          <w:sz w:val="16"/>
+          <w:szCs w:val="16"/>
+          <w:lang w:val="en-US"/>
+        </w:rPr>
+        <w:t>PeQui</w:t>
+      </w:r>
+      <w:proofErr w:type="spellEnd"/>
+      <w:r>
+        <w:rPr>
+          <w:rFonts w:ascii="Times New Roman" w:hAnsi="Times New Roman" w:cs="Times New Roman"/>
+          <w:sz w:val="16"/>
+          <w:szCs w:val="16"/>
+          <w:lang w:val="en-US"/>
+        </w:rPr>
+        <w:t xml:space="preserve"> Project. Science and Justice, v. 54, p. 300–306, 2014.</w:t>
       </w:r>
     </w:p>
     <w:p>
@@ -5765,13 +6953,41 @@
         </w:rPr>
         <w:t xml:space="preserve">SCIENTIFIC WORKING GROUP FOR THE ANALYSIS OF SEIZED DRUGS (SWGDRUG). </w:t>
       </w:r>
-      <w:r>
-        <w:rPr>
-          <w:rFonts w:ascii="Times New Roman" w:hAnsi="Times New Roman" w:cs="Times New Roman"/>
-          <w:sz w:val="16"/>
-          <w:szCs w:val="16"/>
-        </w:rPr>
-        <w:t>Recommendations. Rev. 8.1. [S.l.]: SWGDRUG, 2022. Disponível em: https://www.swgdrug.org. Acesso em: maio 2026.</w:t>
+      <w:proofErr w:type="spellStart"/>
+      <w:r>
+        <w:rPr>
+          <w:rFonts w:ascii="Times New Roman" w:hAnsi="Times New Roman" w:cs="Times New Roman"/>
+          <w:sz w:val="16"/>
+          <w:szCs w:val="16"/>
+        </w:rPr>
+        <w:t>Recommendations</w:t>
+      </w:r>
+      <w:proofErr w:type="spellEnd"/>
+      <w:r>
+        <w:rPr>
+          <w:rFonts w:ascii="Times New Roman" w:hAnsi="Times New Roman" w:cs="Times New Roman"/>
+          <w:sz w:val="16"/>
+          <w:szCs w:val="16"/>
+        </w:rPr>
+        <w:t>. Rev. 8.1. [</w:t>
+      </w:r>
+      <w:proofErr w:type="spellStart"/>
+      <w:r>
+        <w:rPr>
+          <w:rFonts w:ascii="Times New Roman" w:hAnsi="Times New Roman" w:cs="Times New Roman"/>
+          <w:sz w:val="16"/>
+          <w:szCs w:val="16"/>
+        </w:rPr>
+        <w:t>S.l</w:t>
+      </w:r>
+      <w:proofErr w:type="spellEnd"/>
+      <w:r>
+        <w:rPr>
+          <w:rFonts w:ascii="Times New Roman" w:hAnsi="Times New Roman" w:cs="Times New Roman"/>
+          <w:sz w:val="16"/>
+          <w:szCs w:val="16"/>
+        </w:rPr>
+        <w:t>.]: SWGDRUG, 2022. Disponível em: https://www.swgdrug.org. Acesso em: maio 2026.</w:t>
       </w:r>
     </w:p>
     <w:p>
@@ -5840,7 +7056,25 @@
           <w:sz w:val="16"/>
           <w:szCs w:val="16"/>
         </w:rPr>
-        <w:t>Boca Raton: CRC Press, 1999.</w:t>
+        <w:t xml:space="preserve">Boca </w:t>
+      </w:r>
+      <w:proofErr w:type="spellStart"/>
+      <w:r>
+        <w:rPr>
+          <w:rFonts w:ascii="Times New Roman" w:hAnsi="Times New Roman" w:cs="Times New Roman"/>
+          <w:sz w:val="16"/>
+          <w:szCs w:val="16"/>
+        </w:rPr>
+        <w:t>Raton</w:t>
+      </w:r>
+      <w:proofErr w:type="spellEnd"/>
+      <w:r>
+        <w:rPr>
+          <w:rFonts w:ascii="Times New Roman" w:hAnsi="Times New Roman" w:cs="Times New Roman"/>
+          <w:sz w:val="16"/>
+          <w:szCs w:val="16"/>
+        </w:rPr>
+        <w:t>: CRC Press, 1999.</w:t>
       </w:r>
     </w:p>
     <w:p>
@@ -5875,7 +7109,27 @@
           <w:szCs w:val="16"/>
           <w:lang w:val="en-US"/>
         </w:rPr>
-        <w:t>(Cap. 20 — Aminas.)</w:t>
+        <w:t xml:space="preserve">(Cap. 20 — </w:t>
+      </w:r>
+      <w:proofErr w:type="spellStart"/>
+      <w:r>
+        <w:rPr>
+          <w:rFonts w:ascii="Times New Roman" w:hAnsi="Times New Roman" w:cs="Times New Roman"/>
+          <w:sz w:val="16"/>
+          <w:szCs w:val="16"/>
+          <w:lang w:val="en-US"/>
+        </w:rPr>
+        <w:t>Aminas</w:t>
+      </w:r>
+      <w:proofErr w:type="spellEnd"/>
+      <w:r>
+        <w:rPr>
+          <w:rFonts w:ascii="Times New Roman" w:hAnsi="Times New Roman" w:cs="Times New Roman"/>
+          <w:sz w:val="16"/>
+          <w:szCs w:val="16"/>
+          <w:lang w:val="en-US"/>
+        </w:rPr>
+        <w:t>.)</w:t>
       </w:r>
     </w:p>
     <w:p>
@@ -5933,11 +7187,111 @@
     <w:p>
       <w:pPr>
         <w:pStyle w:val="PargrafodaLista"/>
+        <w:numPr>
+          <w:ilvl w:val="0"/>
+          <w:numId w:val="2"/>
+        </w:numPr>
         <w:spacing w:before="40" w:after="60"/>
         <w:ind w:left="567"/>
         <w:jc w:val="both"/>
         <w:rPr>
           <w:rFonts w:ascii="Times New Roman" w:hAnsi="Times New Roman" w:cs="Times New Roman"/>
+          <w:sz w:val="16"/>
+          <w:szCs w:val="16"/>
+        </w:rPr>
+      </w:pPr>
+      <w:r>
+        <w:rPr>
+          <w:rFonts w:ascii="Times New Roman" w:hAnsi="Times New Roman" w:cs="Times New Roman"/>
+          <w:sz w:val="16"/>
+          <w:szCs w:val="16"/>
+        </w:rPr>
+        <w:t>PIAUÍ. Polícia Civil do Estado do Piauí. Portaria nº 56-GDG/AN/2021, de 16 de setembro</w:t>
+      </w:r>
+      <w:r>
+        <w:rPr>
+          <w:rFonts w:ascii="Times New Roman" w:hAnsi="Times New Roman" w:cs="Times New Roman"/>
+          <w:sz w:val="16"/>
+          <w:szCs w:val="16"/>
+        </w:rPr>
+        <w:t xml:space="preserve"> de 2021. Dispõe sobre procedimentos de apreensão, exame de constatação, laudo definitivo, contraprova e incineração de drogas no âmbito da PC-PI. Teresina: PC-PI, 2021. SEI nº 2393293.</w:t>
+      </w:r>
+    </w:p>
+    <w:p>
+      <w:pPr>
+        <w:pStyle w:val="PargrafodaLista"/>
+        <w:numPr>
+          <w:ilvl w:val="0"/>
+          <w:numId w:val="2"/>
+        </w:numPr>
+        <w:spacing w:before="40" w:after="60"/>
+        <w:ind w:left="567"/>
+        <w:jc w:val="both"/>
+        <w:rPr>
+          <w:rFonts w:ascii="Times New Roman" w:hAnsi="Times New Roman" w:cs="Times New Roman"/>
+          <w:sz w:val="16"/>
+          <w:szCs w:val="16"/>
+        </w:rPr>
+      </w:pPr>
+      <w:r>
+        <w:rPr>
+          <w:rFonts w:ascii="Times New Roman" w:hAnsi="Times New Roman" w:cs="Times New Roman"/>
+          <w:sz w:val="16"/>
+          <w:szCs w:val="16"/>
+        </w:rPr>
+        <w:lastRenderedPageBreak/>
+        <w:t>PIAUÍ. Secretaria de Segurança Pública. Instrução Normativa nº 04/2025</w:t>
+      </w:r>
+      <w:r>
+        <w:rPr>
+          <w:rFonts w:ascii="Times New Roman" w:hAnsi="Times New Roman" w:cs="Times New Roman"/>
+          <w:sz w:val="16"/>
+          <w:szCs w:val="16"/>
+        </w:rPr>
+        <w:t>/SSP/PI, de 22 de novembro de 2025. Regula a integração DEPOC/PC-PI e a cadeia de custódia de vestígios. Diário Oficial do Estado do Piauí, n. 229, 28 nov. 2025.</w:t>
+      </w:r>
+    </w:p>
+    <w:p>
+      <w:pPr>
+        <w:pStyle w:val="PargrafodaLista"/>
+        <w:numPr>
+          <w:ilvl w:val="0"/>
+          <w:numId w:val="2"/>
+        </w:numPr>
+        <w:spacing w:before="40" w:after="60"/>
+        <w:ind w:left="567"/>
+        <w:jc w:val="both"/>
+        <w:rPr>
+          <w:rFonts w:ascii="Times New Roman" w:hAnsi="Times New Roman" w:cs="Times New Roman"/>
+          <w:sz w:val="16"/>
+          <w:szCs w:val="16"/>
+        </w:rPr>
+      </w:pPr>
+      <w:r>
+        <w:rPr>
+          <w:rFonts w:ascii="Times New Roman" w:hAnsi="Times New Roman" w:cs="Times New Roman"/>
+          <w:sz w:val="16"/>
+          <w:szCs w:val="16"/>
+        </w:rPr>
+        <w:t>PIAUÍ. Departamento de Polícia Científica. ITU-01/2024/CCV-DEPOC, de 21 de outubro de 2024. In</w:t>
+      </w:r>
+      <w:r>
+        <w:rPr>
+          <w:rFonts w:ascii="Times New Roman" w:hAnsi="Times New Roman" w:cs="Times New Roman"/>
+          <w:sz w:val="16"/>
+          <w:szCs w:val="16"/>
+        </w:rPr>
+        <w:t>strução Técnica sobre embalagens-padrão rastreáveis e formulário de avaliação de vestígios (FAV). Teresina: DEPOC/PC-PI, 2024.</w:t>
+      </w:r>
+    </w:p>
+    <w:p>
+      <w:pPr>
+        <w:pStyle w:val="PargrafodaLista"/>
+        <w:spacing w:before="40" w:after="60"/>
+        <w:ind w:left="567"/>
+        <w:jc w:val="both"/>
+        <w:rPr>
+          <w:rFonts w:ascii="Times New Roman" w:hAnsi="Times New Roman" w:cs="Times New Roman"/>
           <w:sz w:val="24"/>
           <w:szCs w:val="24"/>
         </w:rPr>
@@ -5987,7 +7341,7 @@
           <w:sz w:val="24"/>
           <w:szCs w:val="24"/>
         </w:rPr>
-        <w:t>[N]</w:t>
+        <w:t>8</w:t>
       </w:r>
       <w:r>
         <w:rPr>
@@ -6141,7 +7495,7 @@
         <w:noProof/>
       </w:rPr>
       <w:drawing>
-        <wp:anchor distT="0" distB="0" distL="114300" distR="114300" simplePos="0" relativeHeight="251664384" behindDoc="0" locked="0" layoutInCell="1" allowOverlap="1" wp14:anchorId="0045EE64" wp14:editId="17B903F6">
+        <wp:anchor distT="0" distB="0" distL="114300" distR="114300" simplePos="0" relativeHeight="251664384" behindDoc="0" locked="0" layoutInCell="1" allowOverlap="1" wp14:anchorId="446E9162" wp14:editId="60CC2D00">
           <wp:simplePos x="0" y="0"/>
           <wp:positionH relativeFrom="margin">
             <wp:posOffset>158115</wp:posOffset>
@@ -6332,8 +7686,9 @@
           <w:sz w:val="16"/>
           <w:szCs w:val="16"/>
         </w:rPr>
-        <w:t>Cannabis sp</w:t>
-      </w:r>
+        <w:t xml:space="preserve">Cannabis </w:t>
+      </w:r>
+      <w:proofErr w:type="gramStart"/>
       <w:r>
         <w:rPr>
           <w:rFonts w:ascii="Times New Roman" w:eastAsia="Times New Roman" w:hAnsi="Times New Roman" w:cs="Times New Roman"/>
@@ -6341,6 +7696,15 @@
           <w:sz w:val="16"/>
           <w:szCs w:val="16"/>
         </w:rPr>
+        <w:t>sp</w:t>
+      </w:r>
+      <w:r>
+        <w:rPr>
+          <w:rFonts w:ascii="Times New Roman" w:eastAsia="Times New Roman" w:hAnsi="Times New Roman" w:cs="Times New Roman"/>
+          <w:i/>
+          <w:sz w:val="16"/>
+          <w:szCs w:val="16"/>
+        </w:rPr>
         <w:t>.</w:t>
       </w:r>
       <w:r>
@@ -6349,7 +7713,16 @@
           <w:sz w:val="16"/>
           <w:szCs w:val="16"/>
         </w:rPr>
-        <w:t>. As</w:t>
+        <w:t>.</w:t>
+      </w:r>
+      <w:proofErr w:type="gramEnd"/>
+      <w:r>
+        <w:rPr>
+          <w:rFonts w:ascii="Times New Roman" w:eastAsia="Times New Roman" w:hAnsi="Times New Roman" w:cs="Times New Roman"/>
+          <w:sz w:val="16"/>
+          <w:szCs w:val="16"/>
+        </w:rPr>
+        <w:t xml:space="preserve"> As</w:t>
       </w:r>
       <w:r>
         <w:rPr>
@@ -6465,7 +7838,7 @@
     <w:p>
       <w:pPr>
         <w:pStyle w:val="PargrafodaLista"/>
-        <w:spacing w:before="80" w:after="80" w:line="276" w:lineRule="auto"/>
+        <w:spacing w:before="80" w:after="80"/>
         <w:jc w:val="both"/>
         <w:rPr>
           <w:rFonts w:ascii="Times New Roman" w:hAnsi="Times New Roman" w:cs="Times New Roman"/>
@@ -6522,7 +7895,25 @@
           <w:sz w:val="16"/>
           <w:szCs w:val="16"/>
         </w:rPr>
-        <w:t xml:space="preserve"> (ii) </w:t>
+        <w:t xml:space="preserve"> (</w:t>
+      </w:r>
+      <w:proofErr w:type="spellStart"/>
+      <w:r>
+        <w:rPr>
+          <w:rFonts w:ascii="Times New Roman" w:hAnsi="Times New Roman" w:cs="Times New Roman"/>
+          <w:sz w:val="16"/>
+          <w:szCs w:val="16"/>
+        </w:rPr>
+        <w:t>ii</w:t>
+      </w:r>
+      <w:proofErr w:type="spellEnd"/>
+      <w:r>
+        <w:rPr>
+          <w:rFonts w:ascii="Times New Roman" w:hAnsi="Times New Roman" w:cs="Times New Roman"/>
+          <w:sz w:val="16"/>
+          <w:szCs w:val="16"/>
+        </w:rPr>
+        <w:t xml:space="preserve">) </w:t>
       </w:r>
       <w:r>
         <w:rPr>
@@ -6556,7 +7947,25 @@
           <w:sz w:val="16"/>
           <w:szCs w:val="16"/>
         </w:rPr>
-        <w:t xml:space="preserve"> (iii) </w:t>
+        <w:t xml:space="preserve"> (</w:t>
+      </w:r>
+      <w:proofErr w:type="spellStart"/>
+      <w:r>
+        <w:rPr>
+          <w:rFonts w:ascii="Times New Roman" w:hAnsi="Times New Roman" w:cs="Times New Roman"/>
+          <w:sz w:val="16"/>
+          <w:szCs w:val="16"/>
+        </w:rPr>
+        <w:t>iii</w:t>
+      </w:r>
+      <w:proofErr w:type="spellEnd"/>
+      <w:r>
+        <w:rPr>
+          <w:rFonts w:ascii="Times New Roman" w:hAnsi="Times New Roman" w:cs="Times New Roman"/>
+          <w:sz w:val="16"/>
+          <w:szCs w:val="16"/>
+        </w:rPr>
+        <w:t xml:space="preserve">) </w:t>
       </w:r>
       <w:r>
         <w:rPr>
@@ -6670,7 +8079,7 @@
         <w:sz w:val="20"/>
         <w:szCs w:val="20"/>
       </w:rPr>
-      <w:t>9</w:t>
+      <w:t>[N]</w:t>
     </w:r>
     <w:r>
       <w:rPr>
@@ -6724,7 +8133,7 @@
         <w:sz w:val="20"/>
         <w:szCs w:val="20"/>
       </w:rPr>
-      <w:t>9</w:t>
+      <w:t>[N]</w:t>
     </w:r>
     <w:r>
       <w:rPr>
@@ -6788,7 +8197,7 @@
               <w:lang w:eastAsia="pt-BR" w:bidi="ar-SA"/>
             </w:rPr>
             <w:drawing>
-              <wp:anchor distT="0" distB="0" distL="114300" distR="114300" simplePos="0" relativeHeight="251666432" behindDoc="0" locked="0" layoutInCell="1" allowOverlap="1" wp14:anchorId="3F740D73" wp14:editId="6234BDD5">
+              <wp:anchor distT="0" distB="0" distL="114300" distR="114300" simplePos="0" relativeHeight="251666432" behindDoc="0" locked="0" layoutInCell="1" allowOverlap="1" wp14:anchorId="30CB045A" wp14:editId="7772C7FC">
                 <wp:simplePos x="0" y="0"/>
                 <wp:positionH relativeFrom="margin">
                   <wp:posOffset>-142875</wp:posOffset>
@@ -6872,7 +8281,7 @@
               <w:lang w:eastAsia="pt-BR" w:bidi="ar-SA"/>
             </w:rPr>
             <w:drawing>
-              <wp:anchor distT="0" distB="0" distL="114300" distR="114300" simplePos="0" relativeHeight="251667456" behindDoc="0" locked="0" layoutInCell="1" allowOverlap="1" wp14:anchorId="1C63720B" wp14:editId="7B81DDBA">
+              <wp:anchor distT="0" distB="0" distL="114300" distR="114300" simplePos="0" relativeHeight="251667456" behindDoc="0" locked="0" layoutInCell="1" allowOverlap="1" wp14:anchorId="096EFFD8" wp14:editId="0259A729">
                 <wp:simplePos x="0" y="0"/>
                 <wp:positionH relativeFrom="margin">
                   <wp:posOffset>4217670</wp:posOffset>

</xml_diff>